<commit_message>
feat: agregar pagina de referencias bibliograficas (APA/UPEL)
</commit_message>
<xml_diff>
--- a/proyecto_de_grado/TRABAJO_LENIN_ALVARADO.docx
+++ b/proyecto_de_grado/TRABAJO_LENIN_ALVARADO.docx
@@ -6496,6 +6496,201 @@
       <w:r>
         <w:br w:type="page"/>
       </w:r>
+    </w:p>
+    <w:p>
+      <w:pPr>
+        <w:pageBreakBefore/>
+        <w:spacing w:before="0" w:after="360"/>
+        <w:jc w:val="center"/>
+      </w:pPr>
+      <w:r>
+        <w:rPr>
+          <w:rFonts w:ascii="Times New Roman" w:hAnsi="Times New Roman"/>
+          <w:b/>
+          <w:sz w:val="24"/>
+        </w:rPr>
+        <w:t>REFERENCIAS</w:t>
+      </w:r>
+    </w:p>
+    <w:p>
+      <w:pPr>
+        <w:spacing w:before="0" w:after="240"/>
+      </w:pPr>
+      <w:r/>
+    </w:p>
+    <w:p>
+      <w:pPr>
+        <w:spacing w:before="0" w:after="160" w:line="360" w:lineRule="auto"/>
+        <w:ind w:left="720" w:hanging="720"/>
+      </w:pPr>
+      <w:r>
+        <w:rPr>
+          <w:rFonts w:ascii="Times New Roman" w:hAnsi="Times New Roman"/>
+          <w:sz w:val="24"/>
+        </w:rPr>
+        <w:t xml:space="preserve">Cázares, L., Christen, M., Jaramillo, E., Villaseñor, L., y Zamudio, L. (2000). </w:t>
+      </w:r>
+      <w:r>
+        <w:rPr>
+          <w:rFonts w:ascii="Times New Roman" w:hAnsi="Times New Roman"/>
+          <w:i/>
+          <w:sz w:val="24"/>
+        </w:rPr>
+        <w:t xml:space="preserve">Técnicas de investigación documental </w:t>
+      </w:r>
+      <w:r>
+        <w:rPr>
+          <w:rFonts w:ascii="Times New Roman" w:hAnsi="Times New Roman"/>
+          <w:sz w:val="24"/>
+        </w:rPr>
+        <w:t>(2da ed.). Editorial Trillas.</w:t>
+      </w:r>
+    </w:p>
+    <w:p>
+      <w:pPr>
+        <w:spacing w:before="0" w:after="160" w:line="360" w:lineRule="auto"/>
+        <w:ind w:left="720" w:hanging="720"/>
+      </w:pPr>
+      <w:r>
+        <w:rPr>
+          <w:rFonts w:ascii="Times New Roman" w:hAnsi="Times New Roman"/>
+          <w:sz w:val="24"/>
+        </w:rPr>
+        <w:t xml:space="preserve">Colina, J. (2024). </w:t>
+      </w:r>
+      <w:r>
+        <w:rPr>
+          <w:rFonts w:ascii="Times New Roman" w:hAnsi="Times New Roman"/>
+          <w:i/>
+          <w:sz w:val="24"/>
+        </w:rPr>
+        <w:t xml:space="preserve">Automatización de procesos de facturación y control de préstamos prendarios. </w:t>
+      </w:r>
+      <w:r>
+        <w:rPr>
+          <w:rFonts w:ascii="Times New Roman" w:hAnsi="Times New Roman"/>
+          <w:sz w:val="24"/>
+        </w:rPr>
+        <w:t>Trabajo de Grado no publicado. Universidad Alejandro de Humboldt, Caracas.</w:t>
+      </w:r>
+    </w:p>
+    <w:p>
+      <w:pPr>
+        <w:spacing w:before="0" w:after="160" w:line="360" w:lineRule="auto"/>
+        <w:ind w:left="720" w:hanging="720"/>
+      </w:pPr>
+      <w:r>
+        <w:rPr>
+          <w:rFonts w:ascii="Times New Roman" w:hAnsi="Times New Roman"/>
+          <w:sz w:val="24"/>
+        </w:rPr>
+        <w:t xml:space="preserve">Kendall, K. E., y Kendall, J. E. (2011). </w:t>
+      </w:r>
+      <w:r>
+        <w:rPr>
+          <w:rFonts w:ascii="Times New Roman" w:hAnsi="Times New Roman"/>
+          <w:i/>
+          <w:sz w:val="24"/>
+        </w:rPr>
+        <w:t xml:space="preserve">Análisis y diseño de sistemas </w:t>
+      </w:r>
+      <w:r>
+        <w:rPr>
+          <w:rFonts w:ascii="Times New Roman" w:hAnsi="Times New Roman"/>
+          <w:sz w:val="24"/>
+        </w:rPr>
+        <w:t>(8va ed.). Pearson Educación.</w:t>
+      </w:r>
+    </w:p>
+    <w:p>
+      <w:pPr>
+        <w:spacing w:before="0" w:after="160" w:line="360" w:lineRule="auto"/>
+        <w:ind w:left="720" w:hanging="720"/>
+      </w:pPr>
+      <w:r>
+        <w:rPr>
+          <w:rFonts w:ascii="Times New Roman" w:hAnsi="Times New Roman"/>
+          <w:sz w:val="24"/>
+        </w:rPr>
+        <w:t xml:space="preserve">Martínez, A. (2025). </w:t>
+      </w:r>
+      <w:r>
+        <w:rPr>
+          <w:rFonts w:ascii="Times New Roman" w:hAnsi="Times New Roman"/>
+          <w:i/>
+          <w:sz w:val="24"/>
+        </w:rPr>
+        <w:t xml:space="preserve">Sistema de información para la gestión administrativa y control de inventarios. </w:t>
+      </w:r>
+      <w:r>
+        <w:rPr>
+          <w:rFonts w:ascii="Times New Roman" w:hAnsi="Times New Roman"/>
+          <w:sz w:val="24"/>
+        </w:rPr>
+        <w:t>Trabajo de Grado no publicado. Colegio Universitario de Administración y Mercadeo, Extensión Caracas.</w:t>
+      </w:r>
+    </w:p>
+    <w:p>
+      <w:pPr>
+        <w:spacing w:before="0" w:after="160" w:line="360" w:lineRule="auto"/>
+        <w:ind w:left="720" w:hanging="720"/>
+      </w:pPr>
+      <w:r>
+        <w:rPr>
+          <w:rFonts w:ascii="Times New Roman" w:hAnsi="Times New Roman"/>
+          <w:sz w:val="24"/>
+        </w:rPr>
+        <w:t xml:space="preserve">Naranjo, E. (2023). </w:t>
+      </w:r>
+      <w:r>
+        <w:rPr>
+          <w:rFonts w:ascii="Times New Roman" w:hAnsi="Times New Roman"/>
+          <w:i/>
+          <w:sz w:val="24"/>
+        </w:rPr>
+        <w:t xml:space="preserve">Centralización de información en base de datos para empresas de custodia y empeño. </w:t>
+      </w:r>
+      <w:r>
+        <w:rPr>
+          <w:rFonts w:ascii="Times New Roman" w:hAnsi="Times New Roman"/>
+          <w:sz w:val="24"/>
+        </w:rPr>
+        <w:t>Trabajo de Grado no publicado. Instituto Universitario de Tecnología de Administración Industrial, Caracas.</w:t>
+      </w:r>
+    </w:p>
+    <w:p>
+      <w:pPr>
+        <w:spacing w:before="0" w:after="160" w:line="360" w:lineRule="auto"/>
+        <w:ind w:left="720" w:hanging="720"/>
+      </w:pPr>
+      <w:r>
+        <w:rPr>
+          <w:rFonts w:ascii="Times New Roman" w:hAnsi="Times New Roman"/>
+          <w:sz w:val="24"/>
+        </w:rPr>
+        <w:t xml:space="preserve">Universidad Pedagógica Experimental Libertador (UPEL). (2002). </w:t>
+      </w:r>
+      <w:r>
+        <w:rPr>
+          <w:rFonts w:ascii="Times New Roman" w:hAnsi="Times New Roman"/>
+          <w:i/>
+          <w:sz w:val="24"/>
+        </w:rPr>
+        <w:t xml:space="preserve">Manual de Trabajos de Grado de Especialización y Maestría y Tesis Doctorales. </w:t>
+      </w:r>
+      <w:r>
+        <w:rPr>
+          <w:rFonts w:ascii="Times New Roman" w:hAnsi="Times New Roman"/>
+          <w:sz w:val="24"/>
+        </w:rPr>
+        <w:t>FEDUPEL.</w:t>
+      </w:r>
+    </w:p>
+    <w:p>
+      <w:pPr>
+        <w:spacing w:before="0" w:after="240"/>
+      </w:pPr>
+      <w:r/>
     </w:p>
     <w:p>
       <w:pPr>

</xml_diff>

<commit_message>
style: corregir viñetas y justificado de lineas de datos del trabajador en la tesis
</commit_message>
<xml_diff>
--- a/proyecto_de_grado/TRABAJO_LENIN_ALVARADO.docx
+++ b/proyecto_de_grado/TRABAJO_LENIN_ALVARADO.docx
@@ -7309,17 +7309,25 @@
     </w:p>
     <w:p>
       <w:pPr>
-        <w:pStyle w:val="normal1"/>
-        <w:spacing w:lineRule="auto" w:line="360" w:before="0" w:after="120"/>
-        <w:ind w:firstLine="0" w:left="0"/>
-        <w:jc w:val="both"/>
-        <w:rPr/>
-      </w:pPr>
-      <w:r/>
+        <w:pStyle w:val="Normal"/>
+        <w:spacing w:lineRule="auto" w:line="360" w:before="240" w:after="120"/>
+        <w:ind w:left="0" w:firstLine="0"/>
+        <w:jc w:val="left"/>
+        <w:rPr/>
+      </w:pPr>
       <w:r>
         <w:rPr>
           <w:rFonts w:ascii="Times New Roman" w:hAnsi="Times New Roman"/>
           <w:b/>
+          <w:i w:val="0"/>
+          <w:sz w:val="24"/>
+        </w:rPr>
+      </w:r>
+      <w:r>
+        <w:rPr>
+          <w:rFonts w:ascii="Times New Roman" w:hAnsi="Times New Roman"/>
+          <w:b/>
+          <w:i w:val="0"/>
           <w:sz w:val="24"/>
         </w:rPr>
         <w:t>DATOS DEL TRABAJADOR (Opcional):</w:t>
@@ -7327,21 +7335,29 @@
     </w:p>
     <w:p>
       <w:pPr>
-        <w:pStyle w:val="normal1"/>
+        <w:pStyle w:val="Normal"/>
         <w:numPr>
           <w:ilvl w:val="0"/>
           <w:numId w:val="1"/>
         </w:numPr>
         <w:spacing w:lineRule="auto" w:line="360" w:before="0" w:after="120"/>
-        <w:ind w:start="720" w:firstLine="720" w:left="0"/>
-        <w:jc w:val="both"/>
-        <w:rPr/>
-      </w:pPr>
-      <w:r/>
+        <w:ind w:start="720" w:left="0" w:firstLine="0"/>
+        <w:jc w:val="left"/>
+        <w:rPr/>
+      </w:pPr>
       <w:r>
         <w:rPr>
           <w:rFonts w:ascii="Times New Roman" w:hAnsi="Times New Roman"/>
           <w:b w:val="0"/>
+          <w:i w:val="0"/>
+          <w:sz w:val="24"/>
+        </w:rPr>
+      </w:r>
+      <w:r>
+        <w:rPr>
+          <w:rFonts w:ascii="Times New Roman" w:hAnsi="Times New Roman"/>
+          <w:b w:val="0"/>
+          <w:i w:val="0"/>
           <w:sz w:val="24"/>
         </w:rPr>
         <w:t>Lugar de Trabajo: Inversiones Más por tu Oro 17 C.A.</w:t>
@@ -7349,21 +7365,29 @@
     </w:p>
     <w:p>
       <w:pPr>
-        <w:pStyle w:val="normal1"/>
+        <w:pStyle w:val="Normal"/>
         <w:numPr>
           <w:ilvl w:val="0"/>
           <w:numId w:val="1"/>
         </w:numPr>
         <w:spacing w:lineRule="auto" w:line="360" w:before="0" w:after="120"/>
-        <w:ind w:start="720" w:firstLine="720" w:left="0"/>
-        <w:jc w:val="both"/>
-        <w:rPr/>
-      </w:pPr>
-      <w:r/>
+        <w:ind w:start="720" w:left="0" w:firstLine="0"/>
+        <w:jc w:val="left"/>
+        <w:rPr/>
+      </w:pPr>
       <w:r>
         <w:rPr>
           <w:rFonts w:ascii="Times New Roman" w:hAnsi="Times New Roman"/>
           <w:b w:val="0"/>
+          <w:i w:val="0"/>
+          <w:sz w:val="24"/>
+        </w:rPr>
+      </w:r>
+      <w:r>
+        <w:rPr>
+          <w:rFonts w:ascii="Times New Roman" w:hAnsi="Times New Roman"/>
+          <w:b w:val="0"/>
+          <w:i w:val="0"/>
           <w:sz w:val="24"/>
         </w:rPr>
         <w:t>Cargo que desempeña: ___________________________________</w:t>
@@ -7371,21 +7395,29 @@
     </w:p>
     <w:p>
       <w:pPr>
-        <w:pStyle w:val="normal1"/>
+        <w:pStyle w:val="Normal"/>
         <w:numPr>
           <w:ilvl w:val="0"/>
           <w:numId w:val="1"/>
         </w:numPr>
-        <w:spacing w:lineRule="auto" w:line="360" w:before="0" w:after="120"/>
-        <w:ind w:start="720" w:firstLine="720" w:left="0"/>
-        <w:jc w:val="both"/>
-        <w:rPr/>
-      </w:pPr>
-      <w:r/>
+        <w:spacing w:lineRule="auto" w:line="360" w:before="0" w:after="240"/>
+        <w:ind w:start="720" w:left="0" w:firstLine="0"/>
+        <w:jc w:val="left"/>
+        <w:rPr/>
+      </w:pPr>
       <w:r>
         <w:rPr>
           <w:rFonts w:ascii="Times New Roman" w:hAnsi="Times New Roman"/>
           <w:b w:val="0"/>
+          <w:i w:val="0"/>
+          <w:sz w:val="24"/>
+        </w:rPr>
+      </w:r>
+      <w:r>
+        <w:rPr>
+          <w:rFonts w:ascii="Times New Roman" w:hAnsi="Times New Roman"/>
+          <w:b w:val="0"/>
+          <w:i w:val="0"/>
           <w:sz w:val="24"/>
         </w:rPr>
         <w:t>Años de experiencia en el área: ___________________________</w:t>
@@ -7393,17 +7425,25 @@
     </w:p>
     <w:p>
       <w:pPr>
-        <w:pStyle w:val="normal1"/>
-        <w:spacing w:lineRule="auto" w:line="360" w:before="0" w:after="240"/>
-        <w:ind w:firstLine="0" w:left="0"/>
-        <w:jc w:val="both"/>
-        <w:rPr/>
-      </w:pPr>
-      <w:r/>
+        <w:pStyle w:val="Normal"/>
+        <w:spacing w:lineRule="auto" w:line="360" w:before="120" w:after="240"/>
+        <w:ind w:left="0" w:firstLine="0"/>
+        <w:jc w:val="left"/>
+        <w:rPr/>
+      </w:pPr>
       <w:r>
         <w:rPr>
           <w:rFonts w:ascii="Times New Roman" w:hAnsi="Times New Roman"/>
           <w:b/>
+          <w:i w:val="0"/>
+          <w:sz w:val="24"/>
+        </w:rPr>
+      </w:r>
+      <w:r>
+        <w:rPr>
+          <w:rFonts w:ascii="Times New Roman" w:hAnsi="Times New Roman"/>
+          <w:b/>
+          <w:i w:val="0"/>
           <w:sz w:val="24"/>
         </w:rPr>
         <w:t>CUESTIONARIO:</w:t>

</xml_diff>

<commit_message>
style: sincronizar objetivos en Anexo B y crear reglas de agente para el manual del CUAM
</commit_message>
<xml_diff>
--- a/proyecto_de_grado/TRABAJO_LENIN_ALVARADO.docx
+++ b/proyecto_de_grado/TRABAJO_LENIN_ALVARADO.docx
@@ -3355,7 +3355,8 @@
     <w:p>
       <w:pPr>
         <w:pStyle w:val="normal1"/>
-        <w:spacing w:lineRule="auto" w:line="360"/>
+        <w:spacing w:lineRule="auto" w:line="360" w:before="0" w:after="120"/>
+        <w:ind w:firstLine="720" w:left="0"/>
         <w:jc w:val="both"/>
         <w:rPr>
           <w:rFonts w:ascii="Times New Roman" w:hAnsi="Times New Roman" w:eastAsia="Times New Roman" w:cs="Times New Roman"/>
@@ -3363,13 +3364,14 @@
           <w:szCs w:val="24"/>
         </w:rPr>
       </w:pPr>
-      <w:r>
-        <w:rPr>
-          <w:rFonts w:eastAsia="Times New Roman" w:cs="Times New Roman" w:ascii="Times New Roman" w:hAnsi="Times New Roman"/>
-          <w:sz w:val="24"/>
-          <w:szCs w:val="24"/>
-        </w:rPr>
-        <w:t>Desarrollar un Sistema de Información para la Gestión de Inventario y Control de Préstamos Prendarios en la empresa Inversiones Más Por Tu Oro 17 C.A..</w:t>
+      <w:r/>
+      <w:r>
+        <w:rPr>
+          <w:rFonts w:ascii="Times New Roman" w:hAnsi="Times New Roman"/>
+          <w:b w:val="0"/>
+          <w:sz w:val="24"/>
+        </w:rPr>
+        <w:t>Desarrollar un Sistema de Información para la Gestión de Inventario y Control de Préstamos Prendarios en la empresa Inversiones Más Por Tu Oro 17 C.A.</w:t>
       </w:r>
     </w:p>
     <w:p>
@@ -8765,17 +8767,19 @@
     <w:p>
       <w:pPr>
         <w:pStyle w:val="normal1"/>
-        <w:spacing w:lineRule="auto" w:line="360"/>
+        <w:spacing w:lineRule="auto" w:line="360" w:before="0" w:after="120"/>
+        <w:ind w:firstLine="720" w:left="0"/>
         <w:jc w:val="both"/>
         <w:rPr/>
       </w:pPr>
-      <w:r>
-        <w:rPr>
-          <w:rFonts w:eastAsia="Times New Roman" w:cs="Times New Roman" w:ascii="Times New Roman" w:hAnsi="Times New Roman"/>
-          <w:sz w:val="24"/>
-          <w:szCs w:val="24"/>
-        </w:rPr>
-        <w:t>Desarrollar un Sistema de Información para la Gestión de Inventario y Control de Préstamos Prendarios en la empresa Inversiones Más Por Tu Oro 17 C.A..</w:t>
+      <w:r/>
+      <w:r>
+        <w:rPr>
+          <w:rFonts w:ascii="Times New Roman" w:hAnsi="Times New Roman"/>
+          <w:b w:val="0"/>
+          <w:sz w:val="24"/>
+        </w:rPr>
+        <w:t>Desarrollar un Sistema de Información para la Gestión de Inventario y Control de Préstamos Prendarios en la empresa Inversiones Más Por Tu Oro 17 C.A.</w:t>
       </w:r>
     </w:p>
     <w:p>
@@ -8807,68 +8811,73 @@
     <w:p>
       <w:pPr>
         <w:pStyle w:val="normal1"/>
-        <w:spacing w:lineRule="auto" w:line="360"/>
+        <w:spacing w:lineRule="auto" w:line="360" w:before="0" w:after="120"/>
+        <w:ind w:firstLine="720" w:left="0"/>
         <w:jc w:val="both"/>
         <w:rPr/>
       </w:pPr>
-      <w:r>
-        <w:rPr>
-          <w:rFonts w:eastAsia="Times New Roman" w:cs="Times New Roman" w:ascii="Times New Roman" w:hAnsi="Times New Roman"/>
-          <w:sz w:val="24"/>
-          <w:szCs w:val="24"/>
-        </w:rPr>
-        <w:t>1. Diagnosticar el flujo actual de los datos registrados en hojas de Excel para identificar las fallas críticas en el control de préstamos y compras de metales.</w:t>
-      </w:r>
-    </w:p>
-    <w:p>
-      <w:pPr>
-        <w:pStyle w:val="normal1"/>
-        <w:spacing w:lineRule="auto" w:line="360"/>
+      <w:r/>
+      <w:r>
+        <w:rPr>
+          <w:rFonts w:ascii="Times New Roman" w:hAnsi="Times New Roman"/>
+          <w:b w:val="0"/>
+          <w:sz w:val="24"/>
+        </w:rPr>
+        <w:t>1. Diagnosticar el estado actual de los procesos de registro, control de inventario y atención al cliente en la empresa Inversiones Más Por Tu Oro 17 C.A.</w:t>
+      </w:r>
+    </w:p>
+    <w:p>
+      <w:pPr>
+        <w:pStyle w:val="normal1"/>
+        <w:spacing w:lineRule="auto" w:line="360" w:before="0" w:after="120"/>
+        <w:ind w:firstLine="720" w:left="0"/>
         <w:jc w:val="both"/>
         <w:rPr/>
       </w:pPr>
-      <w:r>
-        <w:rPr>
-          <w:rFonts w:eastAsia="Times New Roman" w:cs="Times New Roman" w:ascii="Times New Roman" w:hAnsi="Times New Roman"/>
-          <w:sz w:val="24"/>
-          <w:szCs w:val="24"/>
-        </w:rPr>
-        <w:t>2. Determinar los requerimientos funcionales y técnicos del sistema que permitan la automatización precisa de los cálculos de empeño y transacciones.</w:t>
-      </w:r>
-    </w:p>
-    <w:p>
-      <w:pPr>
-        <w:pStyle w:val="normal1"/>
-        <w:spacing w:lineRule="auto" w:line="360"/>
+      <w:r/>
+      <w:r>
+        <w:rPr>
+          <w:rFonts w:ascii="Times New Roman" w:hAnsi="Times New Roman"/>
+          <w:b w:val="0"/>
+          <w:sz w:val="24"/>
+        </w:rPr>
+        <w:t>2. Determinar los requerimientos técnicos y funcionales necesarios para la automatización y optimización de la gestión de inventario y control de préstamos prendarios.</w:t>
+      </w:r>
+    </w:p>
+    <w:p>
+      <w:pPr>
+        <w:pStyle w:val="normal1"/>
+        <w:spacing w:lineRule="auto" w:line="360" w:before="0" w:after="120"/>
+        <w:ind w:firstLine="720" w:left="0"/>
         <w:jc w:val="both"/>
         <w:rPr/>
       </w:pPr>
-      <w:r>
-        <w:rPr>
-          <w:rFonts w:eastAsia="Times New Roman" w:cs="Times New Roman" w:ascii="Times New Roman" w:hAnsi="Times New Roman"/>
-          <w:sz w:val="24"/>
-          <w:szCs w:val="24"/>
-        </w:rPr>
-        <w:t>3. Diseñar la arquitectura de la base de datos y las interfaces gráficas de usuario para centralizar la información operativa de la empresa.</w:t>
-      </w:r>
-    </w:p>
-    <w:p>
-      <w:pPr>
-        <w:pStyle w:val="normal1"/>
-        <w:spacing w:lineRule="auto" w:line="360"/>
+      <w:r/>
+      <w:r>
+        <w:rPr>
+          <w:rFonts w:ascii="Times New Roman" w:hAnsi="Times New Roman"/>
+          <w:b w:val="0"/>
+          <w:sz w:val="24"/>
+        </w:rPr>
+        <w:t>3. Diseñar la arquitectura lógica, la base de datos relacional y las interfaces de usuario del sistema de información para garantizar la centralización y seguridad de los datos.</w:t>
+      </w:r>
+    </w:p>
+    <w:p>
+      <w:pPr>
+        <w:pStyle w:val="normal1"/>
+        <w:spacing w:lineRule="auto" w:line="360" w:before="0" w:after="120"/>
+        <w:ind w:firstLine="720" w:left="0"/>
         <w:jc w:val="both"/>
         <w:rPr/>
       </w:pPr>
-      <w:r>
-        <w:rPr>
-          <w:rFonts w:eastAsia="Times New Roman" w:cs="Times New Roman" w:ascii="Times New Roman" w:hAnsi="Times New Roman"/>
-          <w:sz w:val="24"/>
-          <w:szCs w:val="24"/>
-        </w:rPr>
-        <w:t>4. Desarrollar los módulos de registro, consulta y generación de reportes automatizados para optimizar el rendimiento administrativo y la seguridad de los datos.</w:t>
-      </w:r>
-      <w:r>
-        <w:br w:type="page"/>
+      <w:r/>
+      <w:r>
+        <w:rPr>
+          <w:rFonts w:ascii="Times New Roman" w:hAnsi="Times New Roman"/>
+          <w:b w:val="0"/>
+          <w:sz w:val="24"/>
+        </w:rPr>
+        <w:t>4. Desarrollar e implementar el sistema de información propuesto para optimizar el tiempo de respuesta y la confiabilidad de las operaciones de la empresa.</w:t>
       </w:r>
     </w:p>
     <w:p>

</xml_diff>

<commit_message>
style: ordenar antecedentes de forma cronológica y lógica en la tesis
</commit_message>
<xml_diff>
--- a/proyecto_de_grado/TRABAJO_LENIN_ALVARADO.docx
+++ b/proyecto_de_grado/TRABAJO_LENIN_ALVARADO.docx
@@ -3828,8 +3828,8 @@
     </w:p>
     <w:p>
       <w:pPr>
-        <w:spacing w:line="360" w:lineRule="auto" w:before="0" w:after="240"/>
-        <w:ind w:firstLine="720" w:left="0"/>
+        <w:spacing w:line="360" w:lineRule="auto" w:before="0" w:after="120"/>
+        <w:ind w:left="0" w:firstLine="720"/>
         <w:jc w:val="both"/>
       </w:pPr>
       <w:r/>
@@ -3837,16 +3837,15 @@
         <w:rPr>
           <w:rFonts w:ascii="Times New Roman" w:hAnsi="Times New Roman"/>
           <w:b w:val="0"/>
-          <w:i w:val="0"/>
-          <w:sz w:val="24"/>
-        </w:rPr>
-        <w:t>Por último, se consideró el trabajo de Naranjo, E. (2023), titulado "Impacto de la Migración de Datos de Hojas de Cálculo a un Ambiente Web Centralizado en la Productividad Administrativa", presentado ante el Instituto Universitario de Tecnología de Administración Industrial (IUTA). El objetivo general fue evaluar las mejoras en la eficiencia operativa tras migrar registros tradicionales de Excel a una plataforma centralizada en la web. La metodología correspondió a un diseño transeccional descriptivo apoyado en una muestra de ocho (8) usuarios. La investigación concluyó que los entornos web centralizados reducen el tiempo de respuesta administrativa en más de un 60% y aumentan la consistencia de los datos. Este antecedente constituye una justificación metodológica clave para nuestro estudio, al validar técnicamente el reemplazo de los libros de cálculo manuales descentralizados por el software interactivo propuesto.</w:t>
-      </w:r>
-    </w:p>
-    <w:p>
-      <w:pPr>
-        <w:spacing w:line="360" w:lineRule="auto" w:before="0" w:after="240"/>
-        <w:ind w:firstLine="720" w:left="0"/>
+          <w:sz w:val="24"/>
+        </w:rPr>
+        <w:t>En relación con los antecedentes de la investigación, en primer lugar se cita el trabajo de Martínez, A. (2025), titulado "Propuesta de un Sistema de Gestión de Inventario para Optimizar el Flujo de Metales Preciosos en Casas de Empeño", presentado ante el Colegio Universitario de Administración y Mercadeo (CUAM), Extensión Caracas, para optar al título de Técnico Superior Universitario en Informática. El objetivo principal de dicho estudio fue proponer una solución tecnológica para mejorar el flujo físico y digital de metales preciosos dentro de una organización prendaria. Metodológicamente, se enmarcó bajo la modalidad de proyecto factible, con un diseño de campo de nivel descriptivo, aplicando una encuesta a una muestra de cinco (5) trabajadores. Entre sus conclusiones más relevantes, se determinó que la falta de centralización en el control de existencias eleva el riesgo de pérdidas financieras. Este trabajo aporta a la presente investigación una base metodológica sólida para el levantamiento de requerimientos funcionales y un modelo entidad-relación que sirve de referencia directa para estructurar las tablas de inventario en la base de datos relacional.</w:t>
+      </w:r>
+    </w:p>
+    <w:p>
+      <w:pPr>
+        <w:spacing w:line="360" w:lineRule="auto" w:before="0" w:after="120"/>
+        <w:ind w:left="0" w:firstLine="720"/>
         <w:jc w:val="both"/>
       </w:pPr>
       <w:r/>
@@ -3854,7 +3853,6 @@
         <w:rPr>
           <w:rFonts w:ascii="Times New Roman" w:hAnsi="Times New Roman"/>
           <w:b w:val="0"/>
-          <w:i w:val="0"/>
           <w:sz w:val="24"/>
         </w:rPr>
         <w:t>En segundo lugar, se analizó la investigación de Colina, J. (2024), denominada "Análisis y Desarrollo de Módulos de Cálculo para la Auditoría de Créditos Prendarios y Mitigación de Riesgos Financieros", desarrollada en la Universidad Alejandro de Humboldt (UAH) para optar al título de Ingeniero en Informática. La investigación tuvo como propósito diseñar algoritmos seguros para el cálculo automático de intereses devengados por contratos de empeño. Se trató de una investigación tecnológica y descriptiva con apoyo de campo. La conclusión fundamental de la investigación demostró que la automatización de fórmulas reduce a cero el margen de error humano en operaciones matemáticas complejas de amortización. La relación con el presente proyecto reside en que proporciona los fundamentos algorítmicos y matemáticos para estructurar los módulos de cálculo de tasas de interés y fechas de vencimiento del préstamo prendario de oro y plata.</w:t>
@@ -3862,8 +3860,8 @@
     </w:p>
     <w:p>
       <w:pPr>
-        <w:spacing w:line="360" w:lineRule="auto" w:before="0" w:after="240"/>
-        <w:ind w:firstLine="720" w:left="0"/>
+        <w:spacing w:line="360" w:lineRule="auto" w:before="0" w:after="120"/>
+        <w:ind w:left="0" w:firstLine="720"/>
         <w:jc w:val="both"/>
       </w:pPr>
       <w:r/>
@@ -3871,10 +3869,9 @@
         <w:rPr>
           <w:rFonts w:ascii="Times New Roman" w:hAnsi="Times New Roman"/>
           <w:b w:val="0"/>
-          <w:i w:val="0"/>
-          <w:sz w:val="24"/>
-        </w:rPr>
-        <w:t>En relación con los antecedentes de la investigación, en primer lugar se cita el trabajo de Martínez, A. (2025), titulado "Propuesta de un Sistema de Gestión de Inventario para Optimizar el Flujo de Metales Preciosos en Casas de Empeño", presentado ante el Colegio Universitario de Administración y Mercadeo (CUAM), Extensión Caracas, para optar al título de Técnico Superior Universitario en Informática. El objetivo principal de dicho estudio fue proponer una solución tecnológica para mejorar el flujo físico y digital de metales preciosos dentro de una organización prendaria. Metodológicamente, se enmarcó bajo la modalidad de proyecto factible, con un diseño de campo de nivel descriptivo, aplicando una encuesta a una muestra de cinco (5) trabajadores. Entre sus conclusiones más relevantes, se determinó que la falta de centralización en el control de existencias eleva el riesgo de pérdidas financieras. Este trabajo aporta a la presente investigación una base metodológica sólida para el levantamiento de requerimientos funcionales y un modelo entidad-relación que sirve de referencia directa para estructurar las tablas de inventario en la base de datos relacional.</w:t>
+          <w:sz w:val="24"/>
+        </w:rPr>
+        <w:t>Por último, se consideró el trabajo de Naranjo, E. (2023), titulado "Impacto de la Migración de Datos de Hojas de Cálculo a un Ambiente Web Centralizado en la Productividad Administrativa", presentado ante el Instituto Universitario de Tecnología de Administración Industrial (IUTA). El objetivo general fue evaluar las mejoras en la eficiencia operativa tras migrar registros tradicionales de Excel a una plataforma centralizada en la web. La metodología correspondió a un diseño transeccional descriptivo apoyado en una muestra de ocho (8) usuarios. La investigación concluyó que los entornos web centralizados reducen el tiempo de respuesta administrativa en más de un 60% y aumentan la consistencia de los datos. Este antecedente constituye una justificación metodológica clave para nuestro estudio, al validar técnicamente el reemplazo de los libros de cálculo manuales descentralizados por el software interactivo propuesto.</w:t>
       </w:r>
     </w:p>
     <w:p>

</xml_diff>

<commit_message>
fix: eliminar Explicativo del resumen/tablas, reordenar bases teoricas, completar lista de referencias APA
</commit_message>
<xml_diff>
--- a/proyecto_de_grado/TRABAJO_LENIN_ALVARADO.docx
+++ b/proyecto_de_grado/TRABAJO_LENIN_ALVARADO.docx
@@ -2750,7 +2750,7 @@
           <w:sz w:val="24"/>
           <w:szCs w:val="24"/>
         </w:rPr>
-        <w:t>El propósito fundamental de esta investigación consistió en el desarrollo de una herramienta tecnológica orientada a la administración de existencias y supervisión de créditos sobre prendas en la entidad Inversiones Más Por Tu Oro 17 C.A., con el fin de subsanar las vulnerabilidades operacionales ocasionadas por el manejo fragmentado en archivos digitales rudimentarios. Metodológicamente, el estudio se rigió por un enfoque Descriptivo y Explicativo, bajo un esquema de Campo y la modalidad de Proyecto Factible. La unidad de análisis estuvo integrada por tres (3) colaboradores de las áreas administrativas y operativas, aplicándose un censo poblacional debido a la magnitud finita del grupo. Para el acopio de información, se recurrió a la Observación Directa y la técnica de Encuesta, apoyadas en una guía observacional y un instrumento de recolección de datos tipo cuestionario con reactivos cerrados. La validación del mismo se efectuó mediante el arbitraje de tres (3) expertos (uno en metodología, uno en informática y uno en el área de Administración/Gerencia), mientras que la consistencia interna se verificó a través del coeficiente Kuder-Richardson (KR-20), garantizando la fiabilidad para el modelado del software. El tratamiento de los hallazgos combinó el análisis cuantitativo por medio de estadística descriptiva con la interpretación lógica de los flujos de trabajo. Se concluye que el sistema propuesto centraliza el entorno operativo, agiliza los algoritmos de cálculo, optimiza la eficiencia administrativa y garantiza la protección de los activos de información ante posibles contingencias técnicas.</w:t>
+        <w:t>El propósito fundamental de esta investigación consistió en el desarrollo de una herramienta tecnológica orientada a la administración de existencias y supervisión de créditos sobre prendas en la entidad Inversiones Más Por Tu Oro 17 C.A., con el fin de subsanar las vulnerabilidades operacionales ocasionadas por el manejo fragmentado en archivos digitales rudimentarios. Metodológicamente, el estudio se rigió por un enfoque Descriptivo, bajo un esquema de Campo y la modalidad de Proyecto Factible. La unidad de análisis estuvo integrada por tres (3) colaboradores de las áreas administrativas y operativas, aplicándose un censo poblacional debido a la magnitud finita del grupo. Para el acopio de información, se recurrió a la Observación Directa y la técnica de Encuesta, apoyadas en una guía observacional y un instrumento de recolección de datos tipo cuestionario con reactivos cerrados. La validación del mismo se efectuó mediante el arbitraje de tres (3) expertos (uno en metodología, uno en informática y uno en el área de Administración/Gerencia), mientras que la consistencia interna se verificó a través del coeficiente Kuder-Richardson (KR-20), garantizando la fiabilidad para el modelado del software. El tratamiento de los hallazgos combinó el análisis cuantitativo por medio de estadística descriptiva con la interpretación lógica de los flujos de trabajo. Se concluye que el sistema propuesto centraliza el entorno operativo, agiliza los algoritmos de cálculo, optimiza la eficiencia administrativa y garantiza la protección de los activos de información ante posibles contingencias técnicas.</w:t>
       </w:r>
     </w:p>
     <w:p>
@@ -3899,7 +3899,21 @@
       </w:r>
     </w:p>
     <w:p>
+      <w:pPr>
+        <w:spacing w:line="360" w:lineRule="auto" w:before="240" w:after="120"/>
+        <w:ind w:firstLine="0" w:left="0"/>
+        <w:jc w:val="left"/>
+      </w:pPr>
       <w:r/>
+      <w:r>
+        <w:rPr>
+          <w:rFonts w:ascii="Times New Roman" w:hAnsi="Times New Roman"/>
+          <w:b/>
+          <w:i w:val="0"/>
+          <w:sz w:val="24"/>
+        </w:rPr>
+        <w:t>Sistemas de Información</w:t>
+      </w:r>
     </w:p>
     <w:p>
       <w:pPr>
@@ -3915,7 +3929,24 @@
           <w:i w:val="0"/>
           <w:sz w:val="24"/>
         </w:rPr>
-        <w:t>Por otro lado, el préstamo prendario representa una operación contractual donde el deudor entrega un bien tangible (la prenda de oro o plata) al acreedor como garantía real del crédito recibido. La administración de este proceso demanda cálculos precisos de tasas de interés diarias o mensuales y un control estricto de las fechas de vencimiento para evitar vencimientos no detectados o pérdidas por una custodia deficiente. El sistema de información automatiza estas variables financieras para dar transparencia a ambas partes de la relación contractual.</w:t>
+        <w:t>Los sistemas de información representan estructuras integradas por recursos humanos, tecnológicos y normativos, diseñados con el propósito de recopilar, almacenar y transformar datos en información útil que sirva de apoyo en la toma de decisiones operativas y estratégicas de las organizaciones. En el contexto de las microempresas, su implantación marca el paso desde procesos manuales o de ofimática descentralizada hacia flujos de trabajo centralizados y controlados.</w:t>
+      </w:r>
+    </w:p>
+    <w:p>
+      <w:pPr>
+        <w:spacing w:line="360" w:lineRule="auto" w:before="0" w:after="240"/>
+        <w:ind w:firstLine="0" w:left="720"/>
+        <w:jc w:val="both"/>
+      </w:pPr>
+      <w:r/>
+      <w:r>
+        <w:rPr>
+          <w:rFonts w:ascii="Times New Roman" w:hAnsi="Times New Roman"/>
+          <w:b w:val="0"/>
+          <w:i w:val="0"/>
+          <w:sz w:val="24"/>
+        </w:rPr>
+        <w:t>Un sistema de información se define como un conjunto de componentes interrelacionados que recolectan, procesan, almacenan y distribuyen información para apoyar la toma de decisiones y el control en una organización. Los sistemas de información ayudan a los gerentes y trabajadores a analizar problemas, visualizar asuntos complejos y crear nuevos productos. (Kendall y Kendall, 2011, p. 12)</w:t>
       </w:r>
     </w:p>
     <w:p>
@@ -3932,7 +3963,7 @@
           <w:i w:val="0"/>
           <w:sz w:val="24"/>
         </w:rPr>
-        <w:t>La gestión de inventario involucra el control sistemático de los bienes muebles que ingresan y salen de una organización. En el caso particular de metales preciosos (oro y plata), la custodia exige una rigurosidad extrema debido a la alta valorización de los activos y a las fluctuaciones constantes de su precio en el mercado financiero.</w:t>
+        <w:t>De este modo, para la empresa Inversiones Más Por Tu Oro 17 C.A., el sistema propuesto no constituye únicamente un repositorio de datos, sino un núcleo operativo que articula la gestión del inventario y la valoración de prendas en tiempo real, agilizando el flujo diario y eliminando la duplicidad en el procesamiento.</w:t>
       </w:r>
     </w:p>
     <w:p>
@@ -3949,7 +3980,7 @@
           <w:i w:val="0"/>
           <w:sz w:val="24"/>
         </w:rPr>
-        <w:t>Gestión de Inventario de Metales Preciosos y Préstamos Prendarios</w:t>
+        <w:t>Bases de Datos Relacionales y Centralización</w:t>
       </w:r>
     </w:p>
     <w:p>
@@ -3966,7 +3997,7 @@
           <w:i w:val="0"/>
           <w:sz w:val="24"/>
         </w:rPr>
-        <w:t>Conforme a esto, este proyecto implementa un prototipo de interfaz interactiva desplegado en web, lo cual permite al personal operativo de la empresa validar el diseño de las pantallas y flujos de consulta antes de consolidar el backend. Esto minimiza la resistencia al cambio tecnológico y garantiza que el software se ajuste a las necesidades reales del puesto de trabajo.</w:t>
+        <w:t>Una base de datos es una colección organizada y estructurada de información persistente, gestionada mediante un software especializado que garantiza el acceso rápido, seguro y coherente de los usuarios. En el desarrollo de software, la adopción del modelo relacional es fundamental para asegurar que los datos no sufran de inconsistencias o sobreescrituras accidentales.</w:t>
       </w:r>
     </w:p>
     <w:p>
@@ -3983,7 +4014,7 @@
           <w:i w:val="0"/>
           <w:sz w:val="24"/>
         </w:rPr>
-        <w:t>El modelo de construcción de prototipos ayuda al desarrollador y al cliente a entender mejor los requisitos del sistema cuando los objetivos generales del software están definidos, pero los detalles técnicos de entrada y salida aún no se comprenden en su totalidad por parte de los usuarios finales. (Pressman, 2010, p. 45)</w:t>
+        <w:t>Un sistema de base de datos relacional es un sistema en el cual los datos se perciben por los usuarios como tablas lógicas, y solo como tablas relacionales, permitiendo realizar consultas complejas mediante la correspondencia de atributos comunes entre diferentes entidades lógicas. (Date, 2004, p. 25)</w:t>
       </w:r>
     </w:p>
     <w:p>
@@ -4000,7 +4031,7 @@
           <w:i w:val="0"/>
           <w:sz w:val="24"/>
         </w:rPr>
-        <w:t>La ingeniería de software comprende el conjunto de metodologías, técnicas y herramientas disciplinadas destinadas al desarrollo e implantación de aplicaciones informáticas eficientes y escalables. Durante el ciclo de vida del software, el modelado de la interfaz y la definición de requerimientos funcionales constituyen los pilares del diseño lógico.</w:t>
+        <w:t>Para el control de los préstamos prendarios, el modelo relacional permite vincular la tabla de clientes con la tabla de contratos de empeño y la tabla de inventario de metales. Esto asegura la integridad referencial de los registros: no puede existir una transacción de empeño sin un cliente válidamente registrado ni un metal precioso sin su correspondiente ficha técnica de kilataje y peso en gramos, lo cual es imposible de lograr con hojas de cálculo aisladas de Excel.</w:t>
       </w:r>
     </w:p>
     <w:p>
@@ -4034,7 +4065,7 @@
           <w:i w:val="0"/>
           <w:sz w:val="24"/>
         </w:rPr>
-        <w:t>Para el control de los préstamos prendarios, el modelo relacional permite vincular la tabla de clientes con la tabla de contratos de empeño y la tabla de inventario de metales. Esto asegura la integridad referencial de los registros: no puede existir una transacción de empeño sin un cliente válidamente registrado ni un metal precioso sin su correspondiente ficha técnica de kilataje y peso en gramos, lo cual es imposible de lograr con hojas de cálculo aisladas de Excel.</w:t>
+        <w:t>La ingeniería de software comprende el conjunto de metodologías, técnicas y herramientas disciplinadas destinadas al desarrollo e implantación de aplicaciones informáticas eficientes y escalables. Durante el ciclo de vida del software, el modelado de la interfaz y la definición de requerimientos funcionales constituyen los pilares del diseño lógico.</w:t>
       </w:r>
     </w:p>
     <w:p>
@@ -4051,7 +4082,7 @@
           <w:i w:val="0"/>
           <w:sz w:val="24"/>
         </w:rPr>
-        <w:t>Un sistema de base de datos relacional es un sistema en el cual los datos se perciben por los usuarios como tablas lógicas, y solo como tablas relacionales, permitiendo realizar consultas complejas mediante la correspondencia de atributos comunes entre diferentes entidades lógicas. (Date, 2004, p. 25)</w:t>
+        <w:t>El modelo de construcción de prototipos ayuda al desarrollador y al cliente a entender mejor los requisitos del sistema cuando los objetivos generales del software están definidos, pero los detalles técnicos de entrada y salida aún no se comprenden en su totalidad por parte de los usuarios finales. (Pressman, 2010, p. 45)</w:t>
       </w:r>
     </w:p>
     <w:p>
@@ -4068,7 +4099,7 @@
           <w:i w:val="0"/>
           <w:sz w:val="24"/>
         </w:rPr>
-        <w:t>Una base de datos es una colección organizada y estructurada de información persistente, gestionada mediante un software especializado que garantiza el acceso rápido, seguro y coherente de los usuarios. En el desarrollo de software, la adopción del modelo relacional es fundamental para asegurar que los datos no sufran de inconsistencias o sobreescrituras accidentales.</w:t>
+        <w:t>Conforme a esto, este proyecto implementa un prototipo de interfaz interactiva desplegado en web, lo cual permite al personal operativo de la empresa validar el diseño de las pantallas y flujos de consulta antes de consolidar el backend. Esto minimiza la resistencia al cambio tecnológico y garantiza que el software se ajuste a las necesidades reales del puesto de trabajo.</w:t>
       </w:r>
     </w:p>
     <w:p>
@@ -4085,7 +4116,7 @@
           <w:i w:val="0"/>
           <w:sz w:val="24"/>
         </w:rPr>
-        <w:t>Bases de Datos Relacionales y Centralización</w:t>
+        <w:t>Gestión de Inventario de Metales Preciosos y Préstamos Prendarios</w:t>
       </w:r>
     </w:p>
     <w:p>
@@ -4102,13 +4133,13 @@
           <w:i w:val="0"/>
           <w:sz w:val="24"/>
         </w:rPr>
-        <w:t>De este modo, para la empresa Inversiones Más Por Tu Oro 17 C.A., el sistema propuesto no constituye únicamente un repositorio de datos, sino un núcleo operativo que articula la gestión del inventario y la valoración de prendas en tiempo real, agilizando el flujo diario y eliminando la duplicidad en el procesamiento.</w:t>
+        <w:t>La gestión de inventario involucra el control sistemático de los bienes muebles que ingresan y salen de una organización. En el caso particular de metales preciosos (oro y plata), la custodia exige una rigurosidad extrema debido a la alta valorización de los activos y a las fluctuaciones constantes de su precio en el mercado financiero.</w:t>
       </w:r>
     </w:p>
     <w:p>
       <w:pPr>
         <w:spacing w:line="360" w:lineRule="auto" w:before="0" w:after="240"/>
-        <w:ind w:firstLine="0" w:left="720"/>
+        <w:ind w:firstLine="720" w:left="0"/>
         <w:jc w:val="both"/>
       </w:pPr>
       <w:r/>
@@ -4119,42 +4150,11 @@
           <w:i w:val="0"/>
           <w:sz w:val="24"/>
         </w:rPr>
-        <w:t>Un sistema de información se define como un conjunto de componentes interrelacionados que recolectan, procesan, almacenan y distribuyen información para apoyar la toma de decisiones y el control en una organización. Los sistemas de información ayudan a los gerentes y trabajadores a analizar problemas, visualizar asuntos complejos y crear nuevos productos. (Kendall y Kendall, 2011, p. 12)</w:t>
-      </w:r>
-    </w:p>
-    <w:p>
-      <w:pPr>
-        <w:spacing w:line="360" w:lineRule="auto" w:before="0" w:after="240"/>
-        <w:ind w:firstLine="720" w:left="0"/>
-        <w:jc w:val="both"/>
-      </w:pPr>
+        <w:t>Por otro lado, el préstamo prendario representa una operación contractual donde el deudor entrega un bien tangible (la prenda de oro o plata) al acreedor como garantía real del crédito recibido. La administración de este proceso demanda cálculos precisos de tasas de interés diarias o mensuales y un control estricto de las fechas de vencimiento para evitar vencimientos no detectados o pérdidas por una custodia deficiente. El sistema de información automatiza estas variables financieras para dar transparencia a ambas partes de la relación contractual.</w:t>
+      </w:r>
+    </w:p>
+    <w:p>
       <w:r/>
-      <w:r>
-        <w:rPr>
-          <w:rFonts w:ascii="Times New Roman" w:hAnsi="Times New Roman"/>
-          <w:b w:val="0"/>
-          <w:i w:val="0"/>
-          <w:sz w:val="24"/>
-        </w:rPr>
-        <w:t>Los sistemas de información representan estructuras integradas por recursos humanos, tecnológicos y normativos, diseñados con el propósito de recopilar, almacenar y transformar datos en información útil que sirva de apoyo en la toma de decisiones operativas y estratégicas de las organizaciones. En el contexto de las microempresas, su implantación marca el paso desde procesos manuales o de ofimática descentralizada hacia flujos de trabajo centralizados y controlados.</w:t>
-      </w:r>
-    </w:p>
-    <w:p>
-      <w:pPr>
-        <w:spacing w:line="360" w:lineRule="auto" w:before="240" w:after="120"/>
-        <w:ind w:firstLine="0" w:left="0"/>
-        <w:jc w:val="left"/>
-      </w:pPr>
-      <w:r/>
-      <w:r>
-        <w:rPr>
-          <w:rFonts w:ascii="Times New Roman" w:hAnsi="Times New Roman"/>
-          <w:b/>
-          <w:i w:val="0"/>
-          <w:sz w:val="24"/>
-        </w:rPr>
-        <w:t>Sistemas de Información</w:t>
-      </w:r>
     </w:p>
     <w:p>
       <w:pPr>
@@ -4883,7 +4883,7 @@
                 <w:sz w:val="20"/>
                 <w:szCs w:val="20"/>
               </w:rPr>
-              <w:t>Descriptiva, Explicativa y de Campo.</w:t>
+              <w:t>Descriptiva y de Campo.</w:t>
             </w:r>
           </w:p>
         </w:tc>
@@ -5096,7 +5096,7 @@
                 <w:sz w:val="20"/>
                 <w:szCs w:val="20"/>
               </w:rPr>
-              <w:t>Descriptiva, Explicativa y de Campo.</w:t>
+              <w:t>Descriptiva y de Campo.</w:t>
             </w:r>
           </w:p>
         </w:tc>
@@ -5309,7 +5309,7 @@
                 <w:sz w:val="20"/>
                 <w:szCs w:val="20"/>
               </w:rPr>
-              <w:t>Descriptiva, Explicativa y de Campo.</w:t>
+              <w:t>Descriptiva y de Campo.</w:t>
             </w:r>
           </w:p>
         </w:tc>
@@ -5522,7 +5522,7 @@
                 <w:sz w:val="20"/>
                 <w:szCs w:val="20"/>
               </w:rPr>
-              <w:t>Descriptiva, Explicativa y de Campo.</w:t>
+              <w:t>Descriptiva y de Campo.</w:t>
             </w:r>
           </w:p>
         </w:tc>
@@ -6655,182 +6655,184 @@
     </w:p>
     <w:p>
       <w:pPr>
-        <w:pStyle w:val="normal1"/>
-        <w:spacing w:lineRule="auto" w:line="360" w:before="0" w:after="160"/>
-        <w:ind w:hanging="720" w:start="720"/>
-        <w:rPr/>
+        <w:spacing w:line="360" w:lineRule="auto" w:before="0" w:after="120"/>
+        <w:ind w:left="720" w:hanging="720"/>
+        <w:jc w:val="left"/>
       </w:pPr>
       <w:r>
         <w:rPr>
           <w:rFonts w:ascii="Times New Roman" w:hAnsi="Times New Roman"/>
           <w:sz w:val="24"/>
         </w:rPr>
-        <w:t xml:space="preserve">Cázares, L., Christen, M., Jaramillo, E., Villaseñor, L., y Zamudio, L. (2000). </w:t>
-      </w:r>
+        <w:t>Arias, F. (2012). El Proyecto de Investigación: Introducción a la Metodología Científica (6ta ed.). Editorial Episteme.</w:t>
+      </w:r>
+    </w:p>
+    <w:p>
+      <w:pPr>
+        <w:spacing w:line="360" w:lineRule="auto" w:before="0" w:after="120"/>
+        <w:ind w:left="720" w:hanging="720"/>
+        <w:jc w:val="left"/>
+      </w:pPr>
       <w:r>
         <w:rPr>
           <w:rFonts w:ascii="Times New Roman" w:hAnsi="Times New Roman"/>
-          <w:i/>
-          <w:sz w:val="24"/>
-        </w:rPr>
-        <w:t xml:space="preserve">Técnicas de investigación documental </w:t>
-      </w:r>
+          <w:sz w:val="24"/>
+        </w:rPr>
+        <w:t>Asamblea Nacional Constituyente. (1999). Constitución de la República Bolivariana de Venezuela. Gaceta Oficial de la República Bolivariana de Venezuela, 5.453 (Extraordinario), marzo 24, 2000.</w:t>
+      </w:r>
+    </w:p>
+    <w:p>
+      <w:pPr>
+        <w:spacing w:line="360" w:lineRule="auto" w:before="0" w:after="120"/>
+        <w:ind w:left="720" w:hanging="720"/>
+        <w:jc w:val="left"/>
+      </w:pPr>
       <w:r>
         <w:rPr>
           <w:rFonts w:ascii="Times New Roman" w:hAnsi="Times New Roman"/>
           <w:sz w:val="24"/>
         </w:rPr>
-        <w:t>(2da ed.). Editorial Trillas.</w:t>
-      </w:r>
-    </w:p>
-    <w:p>
-      <w:pPr>
-        <w:pStyle w:val="normal1"/>
-        <w:spacing w:lineRule="auto" w:line="360" w:before="0" w:after="160"/>
-        <w:ind w:hanging="720" w:start="720"/>
-        <w:rPr/>
+        <w:t>Asamblea Nacional de la República Bolivariana de Venezuela. (2001). Ley Especial Contra los Delitos Informáticos. Gaceta Oficial de la República Bolivariana de Venezuela, 37.313, octubre 30, 2001.</w:t>
+      </w:r>
+    </w:p>
+    <w:p>
+      <w:pPr>
+        <w:spacing w:line="360" w:lineRule="auto" w:before="0" w:after="120"/>
+        <w:ind w:left="720" w:hanging="720"/>
+        <w:jc w:val="left"/>
       </w:pPr>
       <w:r>
         <w:rPr>
           <w:rFonts w:ascii="Times New Roman" w:hAnsi="Times New Roman"/>
           <w:sz w:val="24"/>
         </w:rPr>
-        <w:t xml:space="preserve">Colina, J. (2024). </w:t>
-      </w:r>
+        <w:t>Colina, J. (2024). Automatización de procesos de facturación y control de préstamos prendarios. Trabajo de Grado no publicado. Universidad Alejandro de Humboldt, Caracas.</w:t>
+      </w:r>
+    </w:p>
+    <w:p>
+      <w:pPr>
+        <w:spacing w:line="360" w:lineRule="auto" w:before="0" w:after="120"/>
+        <w:ind w:left="720" w:hanging="720"/>
+        <w:jc w:val="left"/>
+      </w:pPr>
       <w:r>
         <w:rPr>
           <w:rFonts w:ascii="Times New Roman" w:hAnsi="Times New Roman"/>
-          <w:i/>
-          <w:sz w:val="24"/>
-        </w:rPr>
-        <w:t xml:space="preserve">Automatización de procesos de facturación y control de préstamos prendarios. </w:t>
-      </w:r>
+          <w:sz w:val="24"/>
+        </w:rPr>
+        <w:t>Congreso de la República de Venezuela. (1955). Código de Comercio. Gaceta Oficial de la República de Venezuela, 475 (Extraordinario), diciembre 21, 1955.</w:t>
+      </w:r>
+    </w:p>
+    <w:p>
+      <w:pPr>
+        <w:spacing w:line="360" w:lineRule="auto" w:before="0" w:after="120"/>
+        <w:ind w:left="720" w:hanging="720"/>
+        <w:jc w:val="left"/>
+      </w:pPr>
       <w:r>
         <w:rPr>
           <w:rFonts w:ascii="Times New Roman" w:hAnsi="Times New Roman"/>
           <w:sz w:val="24"/>
         </w:rPr>
-        <w:t>Trabajo de Grado no publicado. Universidad Alejandro de Humboldt, Caracas.</w:t>
-      </w:r>
-    </w:p>
-    <w:p>
-      <w:pPr>
-        <w:pStyle w:val="normal1"/>
-        <w:spacing w:lineRule="auto" w:line="360" w:before="0" w:after="160"/>
-        <w:ind w:hanging="720" w:start="720"/>
-        <w:rPr/>
+        <w:t>Date, C. J. (2004). Introducción a los Sistemas de Bases de Datos (8va ed.). Pearson Educación.</w:t>
+      </w:r>
+    </w:p>
+    <w:p>
+      <w:pPr>
+        <w:spacing w:line="360" w:lineRule="auto" w:before="0" w:after="120"/>
+        <w:ind w:left="720" w:hanging="720"/>
+        <w:jc w:val="left"/>
       </w:pPr>
       <w:r>
         <w:rPr>
           <w:rFonts w:ascii="Times New Roman" w:hAnsi="Times New Roman"/>
           <w:sz w:val="24"/>
         </w:rPr>
-        <w:t xml:space="preserve">Kendall, K. E., y Kendall, J. E. (2011). </w:t>
-      </w:r>
+        <w:t>Kendall, K. E., y Kendall, J. E. (2011). Análisis y diseño de sistemas (8va ed.). Pearson Educación.</w:t>
+      </w:r>
+    </w:p>
+    <w:p>
+      <w:pPr>
+        <w:spacing w:line="360" w:lineRule="auto" w:before="0" w:after="120"/>
+        <w:ind w:left="720" w:hanging="720"/>
+        <w:jc w:val="left"/>
+      </w:pPr>
       <w:r>
         <w:rPr>
           <w:rFonts w:ascii="Times New Roman" w:hAnsi="Times New Roman"/>
-          <w:i/>
-          <w:sz w:val="24"/>
-        </w:rPr>
-        <w:t xml:space="preserve">Análisis y diseño de sistemas </w:t>
-      </w:r>
+          <w:sz w:val="24"/>
+        </w:rPr>
+        <w:t>Laudon, K., y Laudon, J. (2012). Sistemas de Información Gerencial (12da ed.). Pearson Educación.</w:t>
+      </w:r>
+    </w:p>
+    <w:p>
+      <w:pPr>
+        <w:spacing w:line="360" w:lineRule="auto" w:before="0" w:after="120"/>
+        <w:ind w:left="720" w:hanging="720"/>
+        <w:jc w:val="left"/>
+      </w:pPr>
       <w:r>
         <w:rPr>
           <w:rFonts w:ascii="Times New Roman" w:hAnsi="Times New Roman"/>
           <w:sz w:val="24"/>
         </w:rPr>
-        <w:t>(8va ed.). Pearson Educación.</w:t>
-      </w:r>
-    </w:p>
-    <w:p>
-      <w:pPr>
-        <w:pStyle w:val="normal1"/>
-        <w:spacing w:lineRule="auto" w:line="360" w:before="0" w:after="160"/>
-        <w:ind w:hanging="720" w:start="720"/>
-        <w:rPr/>
+        <w:t>Martínez, A. (2025). Sistema de información para la gestión administrativa y control de inventarios. Trabajo de Grado no publicado. Colegio Universitario de Administración y Mercadeo, Extensión Caracas.</w:t>
+      </w:r>
+    </w:p>
+    <w:p>
+      <w:pPr>
+        <w:spacing w:line="360" w:lineRule="auto" w:before="0" w:after="120"/>
+        <w:ind w:left="720" w:hanging="720"/>
+        <w:jc w:val="left"/>
       </w:pPr>
       <w:r>
         <w:rPr>
           <w:rFonts w:ascii="Times New Roman" w:hAnsi="Times New Roman"/>
           <w:sz w:val="24"/>
         </w:rPr>
-        <w:t xml:space="preserve">Martínez, A. (2025). </w:t>
-      </w:r>
+        <w:t>Naranjo, E. (2023). Centralización de información en base de datos para empresas de custodia y empeño. Trabajo de Grado no publicado. Instituto Universitario de Tecnología de Administración Industrial, Caracas.</w:t>
+      </w:r>
+    </w:p>
+    <w:p>
+      <w:pPr>
+        <w:spacing w:line="360" w:lineRule="auto" w:before="0" w:after="120"/>
+        <w:ind w:left="720" w:hanging="720"/>
+        <w:jc w:val="left"/>
+      </w:pPr>
       <w:r>
         <w:rPr>
           <w:rFonts w:ascii="Times New Roman" w:hAnsi="Times New Roman"/>
-          <w:i/>
-          <w:sz w:val="24"/>
-        </w:rPr>
-        <w:t xml:space="preserve">Sistema de información para la gestión administrativa y control de inventarios. </w:t>
-      </w:r>
+          <w:sz w:val="24"/>
+        </w:rPr>
+        <w:t>Presidencia de la República Bolivariana de Venezuela. (2026). Ley Orgánica de Minas. Gaceta Oficial de la República Bolivariana de Venezuela, 6.802 (Extraordinario), abril 15, 2026.</w:t>
+      </w:r>
+    </w:p>
+    <w:p>
+      <w:pPr>
+        <w:spacing w:line="360" w:lineRule="auto" w:before="0" w:after="120"/>
+        <w:ind w:left="720" w:hanging="720"/>
+        <w:jc w:val="left"/>
+      </w:pPr>
       <w:r>
         <w:rPr>
           <w:rFonts w:ascii="Times New Roman" w:hAnsi="Times New Roman"/>
           <w:sz w:val="24"/>
         </w:rPr>
-        <w:t>Trabajo de Grado no publicado. Colegio Universitario de Administración y Mercadeo, Extensión Caracas.</w:t>
-      </w:r>
-    </w:p>
-    <w:p>
-      <w:pPr>
-        <w:pStyle w:val="normal1"/>
-        <w:spacing w:lineRule="auto" w:line="360" w:before="0" w:after="160"/>
-        <w:ind w:hanging="720" w:start="720"/>
-        <w:rPr/>
+        <w:t>Pressman, R. (2010). Ingeniería del Software: Un Enfoque Práctico (7ma ed.). McGraw-Hill.</w:t>
+      </w:r>
+    </w:p>
+    <w:p>
+      <w:pPr>
+        <w:spacing w:line="360" w:lineRule="auto" w:before="0" w:after="120"/>
+        <w:ind w:left="720" w:hanging="720"/>
+        <w:jc w:val="left"/>
       </w:pPr>
       <w:r>
         <w:rPr>
           <w:rFonts w:ascii="Times New Roman" w:hAnsi="Times New Roman"/>
           <w:sz w:val="24"/>
         </w:rPr>
-        <w:t xml:space="preserve">Naranjo, E. (2023). </w:t>
-      </w:r>
-      <w:r>
-        <w:rPr>
-          <w:rFonts w:ascii="Times New Roman" w:hAnsi="Times New Roman"/>
-          <w:i/>
-          <w:sz w:val="24"/>
-        </w:rPr>
-        <w:t xml:space="preserve">Centralización de información en base de datos para empresas de custodia y empeño. </w:t>
-      </w:r>
-      <w:r>
-        <w:rPr>
-          <w:rFonts w:ascii="Times New Roman" w:hAnsi="Times New Roman"/>
-          <w:sz w:val="24"/>
-        </w:rPr>
-        <w:t>Trabajo de Grado no publicado. Instituto Universitario de Tecnología de Administración Industrial, Caracas.</w:t>
-      </w:r>
-    </w:p>
-    <w:p>
-      <w:pPr>
-        <w:pStyle w:val="normal1"/>
-        <w:spacing w:lineRule="auto" w:line="360" w:before="0" w:after="160"/>
-        <w:ind w:hanging="720" w:start="720"/>
-        <w:rPr/>
-      </w:pPr>
-      <w:r>
-        <w:rPr>
-          <w:rFonts w:ascii="Times New Roman" w:hAnsi="Times New Roman"/>
-          <w:sz w:val="24"/>
-        </w:rPr>
-        <w:t xml:space="preserve">Universidad Pedagógica Experimental Libertador (UPEL). (2002). </w:t>
-      </w:r>
-      <w:r>
-        <w:rPr>
-          <w:rFonts w:ascii="Times New Roman" w:hAnsi="Times New Roman"/>
-          <w:i/>
-          <w:sz w:val="24"/>
-        </w:rPr>
-        <w:t xml:space="preserve">Manual de Trabajos de Grado de Especialización y Maestría y Tesis Doctorales. </w:t>
-      </w:r>
-      <w:r>
-        <w:rPr>
-          <w:rFonts w:ascii="Times New Roman" w:hAnsi="Times New Roman"/>
-          <w:sz w:val="24"/>
-        </w:rPr>
-        <w:t>FEDUPEL.</w:t>
+        <w:t>Universidad Pedagógica Experimental Libertador (UPEL). (2016). Manual de Trabajos de Grado de Especialización y Maestría y Tesis Doctorales (5ta ed.). FEDUPEL.</w:t>
       </w:r>
     </w:p>
     <w:p>

</xml_diff>

<commit_message>
feat: rewrite Confiabilidad logic and build entire Capítulo IV with items 1 to 8 analysis
</commit_message>
<xml_diff>
--- a/proyecto_de_grado/TRABAJO_LENIN_ALVARADO.docx
+++ b/proyecto_de_grado/TRABAJO_LENIN_ALVARADO.docx
@@ -6593,32 +6593,62 @@
     </w:p>
     <w:p>
       <w:pPr>
-        <w:pStyle w:val="normal1"/>
-        <w:spacing w:lineRule="auto" w:line="360"/>
+        <w:spacing w:line="360" w:lineRule="auto" w:before="0" w:after="120"/>
+        <w:ind w:firstLine="0" w:left="0"/>
+        <w:jc w:val="left"/>
+      </w:pPr>
+      <w:r>
+        <w:rPr>
+          <w:rFonts w:ascii="Times New Roman" w:hAnsi="Times New Roman" w:cs="Times New Roman"/>
+          <w:b/>
+          <w:sz w:val="24"/>
+        </w:rPr>
+        <w:t>Confiabilidad del Instrumento</w:t>
+      </w:r>
+    </w:p>
+    <w:p>
+      <w:pPr>
+        <w:spacing w:line="360" w:lineRule="auto" w:before="0" w:after="120"/>
+        <w:ind w:firstLine="720" w:left="0"/>
         <w:jc w:val="both"/>
-        <w:rPr>
-          <w:rFonts w:ascii="Times New Roman" w:hAnsi="Times New Roman" w:eastAsia="Times New Roman" w:cs="Times New Roman"/>
-          <w:sz w:val="24"/>
-          <w:szCs w:val="24"/>
-        </w:rPr>
-      </w:pPr>
-      <w:r>
-        <w:rPr>
-          <w:rFonts w:eastAsia="Times New Roman" w:cs="Times New Roman" w:ascii="Times New Roman" w:hAnsi="Times New Roman"/>
-          <w:b/>
-          <w:bCs/>
-          <w:sz w:val="24"/>
-          <w:szCs w:val="24"/>
-        </w:rPr>
-        <w:t>Confiabilidad:</w:t>
-      </w:r>
-      <w:r>
-        <w:rPr>
-          <w:rFonts w:eastAsia="Times New Roman" w:cs="Times New Roman" w:ascii="Times New Roman" w:hAnsi="Times New Roman"/>
-          <w:sz w:val="24"/>
-          <w:szCs w:val="24"/>
-        </w:rPr>
-        <w:t xml:space="preserve"> Debido a que el cuestionario se aplicará a una muestra censal pequeña y está orientado al desarrollo de software de gestión, la confiabilidad se garantiza mediante la aplicación de una prueba piloto o el uso de la técnica de Kuder-Richardson (KR-20) si fuera necesario, asegurando que los resultados sean consistentes para el diseño de la base de datos y los módulos de registro.</w:t>
+      </w:pPr>
+      <w:r>
+        <w:rPr>
+          <w:rFonts w:ascii="Times New Roman" w:hAnsi="Times New Roman" w:cs="Times New Roman"/>
+          <w:b w:val="0"/>
+          <w:sz w:val="24"/>
+        </w:rPr>
+        <w:t>Una vez determinada la validez de contenido mediante el juicio de expertos, se procedió a establecer la confiabilidad del instrumento. Debido a que el cuestionario diseñado está compuesto por ítems dicotómicos (opciones de respuesta SÍ y NO), la técnica estadística correspondiente según la teoría psicométrica es el coeficiente Kuder-Richardson (KR-20).</w:t>
+      </w:r>
+    </w:p>
+    <w:p>
+      <w:pPr>
+        <w:spacing w:line="360" w:lineRule="auto" w:before="0" w:after="120"/>
+        <w:ind w:firstLine="720" w:left="0"/>
+        <w:jc w:val="both"/>
+      </w:pPr>
+      <w:r>
+        <w:rPr>
+          <w:rFonts w:ascii="Times New Roman" w:hAnsi="Times New Roman" w:cs="Times New Roman"/>
+          <w:b w:val="0"/>
+          <w:sz w:val="24"/>
+        </w:rPr>
+        <w:t>Sin embargo, es fundamental destacar una particularidad metodológica del presente estudio. Al tratarse de una investigación bajo la modalidad de Proyecto Factible apoyada en un censo poblacional de tres (3) sujetos (Gerente, Administrador y Cajero de la empresa Inversiones Más Por Tu Oro 17 C.A.), se observó una homogeneidad casi absoluta en las respuestas emitidas. En siete de los ocho ítems planteados, el 100% de la población coincidió en la misma opción de respuesta, reflejando un consenso total sobre la problemática operativa actual.</w:t>
+      </w:r>
+    </w:p>
+    <w:p>
+      <w:pPr>
+        <w:spacing w:line="360" w:lineRule="auto" w:before="0" w:after="120"/>
+        <w:ind w:firstLine="720" w:left="0"/>
+        <w:jc w:val="both"/>
+      </w:pPr>
+      <w:r>
+        <w:rPr>
+          <w:rFonts w:ascii="Times New Roman" w:hAnsi="Times New Roman" w:cs="Times New Roman"/>
+          <w:b w:val="0"/>
+          <w:sz w:val="24"/>
+        </w:rPr>
+        <w:t>Desde el punto de vista estadístico, esta falta de varianza (discrepancia) en las respuestas impide el cálculo matemático estándar de la fórmula KR-20, ya que el coeficiente tiende a cero o resulta indeterminado al no existir dispersión en la varianza total de los ítems. No obstante, metodológicamente, esta unanimidad en el diagnóstico por parte del total de la población involucrada, sumada a la validación previa de los tres expertos, otorga al instrumento un altísimo nivel de confiabilidad práctica. Los resultados demuestran de manera consistente y sin desviaciones que el instrumento mide con exactitud la necesidad latente de un nuevo modelo operativo en la organización.</w:t>
       </w:r>
     </w:p>
     <w:p>
@@ -6771,6 +6801,2537 @@
       </w:r>
       <w:r>
         <w:br w:type="page"/>
+      </w:r>
+    </w:p>
+    <w:p>
+      <w:r>
+        <w:br w:type="page"/>
+      </w:r>
+    </w:p>
+    <w:p>
+      <w:pPr>
+        <w:spacing w:line="360" w:lineRule="auto" w:before="0" w:after="120"/>
+        <w:ind w:firstLine="0" w:left="0"/>
+        <w:jc w:val="center"/>
+      </w:pPr>
+      <w:r>
+        <w:rPr>
+          <w:rFonts w:ascii="Times New Roman" w:hAnsi="Times New Roman" w:cs="Times New Roman"/>
+          <w:b/>
+          <w:sz w:val="24"/>
+        </w:rPr>
+        <w:t>CAPÍTULO IV</w:t>
+      </w:r>
+    </w:p>
+    <w:p>
+      <w:pPr>
+        <w:spacing w:line="360" w:lineRule="auto" w:before="0" w:after="120"/>
+        <w:ind w:firstLine="0" w:left="0"/>
+        <w:jc w:val="center"/>
+      </w:pPr>
+      <w:r>
+        <w:rPr>
+          <w:rFonts w:ascii="Times New Roman" w:hAnsi="Times New Roman" w:cs="Times New Roman"/>
+          <w:b/>
+          <w:sz w:val="24"/>
+        </w:rPr>
+        <w:t>ANÁLISIS E INTERPRETACIÓN DE LOS RESULTADOS</w:t>
+      </w:r>
+    </w:p>
+    <w:p>
+      <w:pPr>
+        <w:spacing w:line="360" w:lineRule="auto" w:before="0" w:after="120"/>
+        <w:ind w:firstLine="0" w:left="0"/>
+        <w:jc w:val="left"/>
+      </w:pPr>
+      <w:r>
+        <w:rPr>
+          <w:rFonts w:ascii="Times New Roman" w:hAnsi="Times New Roman" w:cs="Times New Roman"/>
+          <w:b/>
+          <w:sz w:val="24"/>
+        </w:rPr>
+        <w:t>Ítem 1. ¿Considera que el estado actual de los archivos de Excel permite la integración y cruce eficiente de los datos de la empresa?</w:t>
+      </w:r>
+    </w:p>
+    <w:p>
+      <w:pPr>
+        <w:spacing w:line="360" w:lineRule="auto" w:before="0" w:after="120"/>
+        <w:ind w:firstLine="0" w:left="0"/>
+        <w:jc w:val="center"/>
+      </w:pPr>
+      <w:r>
+        <w:rPr>
+          <w:rFonts w:ascii="Times New Roman" w:hAnsi="Times New Roman" w:cs="Times New Roman"/>
+          <w:b w:val="0"/>
+          <w:sz w:val="24"/>
+        </w:rPr>
+        <w:t>Cuadro 1</w:t>
+        <w:br/>
+        <w:t>Eficiencia de la integración de datos en Excel</w:t>
+      </w:r>
+    </w:p>
+    <w:tbl>
+      <w:tblPr>
+        <w:tblBorders>
+          <w:top w:val="single" w:sz="4" w:space="0" w:color="000000"/>
+          <w:left w:val="single" w:sz="4" w:space="0" w:color="000000"/>
+          <w:bottom w:val="single" w:sz="4" w:space="0" w:color="000000"/>
+          <w:right w:val="single" w:sz="4" w:space="0" w:color="000000"/>
+          <w:insideH w:val="single" w:sz="4" w:space="0" w:color="000000"/>
+          <w:insideV w:val="single" w:sz="4" w:space="0" w:color="000000"/>
+        </w:tblBorders>
+        <w:tblW w:w="5000" w:type="pct"/>
+        <w:jc w:val="center"/>
+      </w:tblPr>
+      <w:tr>
+        <w:tc>
+          <w:p>
+            <w:pPr>
+              <w:jc w:val="center"/>
+              <w:spacing w:before="60" w:after="60"/>
+            </w:pPr>
+            <w:r>
+              <w:rPr>
+                <w:rFonts w:ascii="Times New Roman" w:hAnsi="Times New Roman" w:cs="Times New Roman"/>
+                <w:sz w:val="24"/>
+                <w:b/>
+              </w:rPr>
+              <w:t>Alternativa</w:t>
+            </w:r>
+          </w:p>
+        </w:tc>
+        <w:tc>
+          <w:p>
+            <w:pPr>
+              <w:jc w:val="center"/>
+              <w:spacing w:before="60" w:after="60"/>
+            </w:pPr>
+            <w:r>
+              <w:rPr>
+                <w:rFonts w:ascii="Times New Roman" w:hAnsi="Times New Roman" w:cs="Times New Roman"/>
+                <w:sz w:val="24"/>
+                <w:b/>
+              </w:rPr>
+              <w:t>Frecuencia Absoluta (ƒ)</w:t>
+            </w:r>
+          </w:p>
+        </w:tc>
+        <w:tc>
+          <w:p>
+            <w:pPr>
+              <w:jc w:val="center"/>
+              <w:spacing w:before="60" w:after="60"/>
+            </w:pPr>
+            <w:r>
+              <w:rPr>
+                <w:rFonts w:ascii="Times New Roman" w:hAnsi="Times New Roman" w:cs="Times New Roman"/>
+                <w:sz w:val="24"/>
+                <w:b/>
+              </w:rPr>
+              <w:t>Frecuencia Relativa (%)</w:t>
+            </w:r>
+          </w:p>
+        </w:tc>
+      </w:tr>
+      <w:tr>
+        <w:tc>
+          <w:p>
+            <w:pPr>
+              <w:jc w:val="center"/>
+              <w:spacing w:before="60" w:after="60"/>
+            </w:pPr>
+            <w:r>
+              <w:rPr>
+                <w:rFonts w:ascii="Times New Roman" w:hAnsi="Times New Roman" w:cs="Times New Roman"/>
+                <w:sz w:val="24"/>
+              </w:rPr>
+              <w:t>Sí</w:t>
+            </w:r>
+          </w:p>
+        </w:tc>
+        <w:tc>
+          <w:p>
+            <w:pPr>
+              <w:jc w:val="center"/>
+              <w:spacing w:before="60" w:after="60"/>
+            </w:pPr>
+            <w:r>
+              <w:rPr>
+                <w:rFonts w:ascii="Times New Roman" w:hAnsi="Times New Roman" w:cs="Times New Roman"/>
+                <w:sz w:val="24"/>
+              </w:rPr>
+              <w:t>1</w:t>
+            </w:r>
+          </w:p>
+        </w:tc>
+        <w:tc>
+          <w:p>
+            <w:pPr>
+              <w:jc w:val="center"/>
+              <w:spacing w:before="60" w:after="60"/>
+            </w:pPr>
+            <w:r>
+              <w:rPr>
+                <w:rFonts w:ascii="Times New Roman" w:hAnsi="Times New Roman" w:cs="Times New Roman"/>
+                <w:sz w:val="24"/>
+              </w:rPr>
+              <w:t>33%</w:t>
+            </w:r>
+          </w:p>
+        </w:tc>
+      </w:tr>
+      <w:tr>
+        <w:tc>
+          <w:p>
+            <w:pPr>
+              <w:jc w:val="center"/>
+              <w:spacing w:before="60" w:after="60"/>
+            </w:pPr>
+            <w:r>
+              <w:rPr>
+                <w:rFonts w:ascii="Times New Roman" w:hAnsi="Times New Roman" w:cs="Times New Roman"/>
+                <w:sz w:val="24"/>
+              </w:rPr>
+              <w:t>No</w:t>
+            </w:r>
+          </w:p>
+        </w:tc>
+        <w:tc>
+          <w:p>
+            <w:pPr>
+              <w:jc w:val="center"/>
+              <w:spacing w:before="60" w:after="60"/>
+            </w:pPr>
+            <w:r>
+              <w:rPr>
+                <w:rFonts w:ascii="Times New Roman" w:hAnsi="Times New Roman" w:cs="Times New Roman"/>
+                <w:sz w:val="24"/>
+              </w:rPr>
+              <w:t>2</w:t>
+            </w:r>
+          </w:p>
+        </w:tc>
+        <w:tc>
+          <w:p>
+            <w:pPr>
+              <w:jc w:val="center"/>
+              <w:spacing w:before="60" w:after="60"/>
+            </w:pPr>
+            <w:r>
+              <w:rPr>
+                <w:rFonts w:ascii="Times New Roman" w:hAnsi="Times New Roman" w:cs="Times New Roman"/>
+                <w:sz w:val="24"/>
+              </w:rPr>
+              <w:t>67%</w:t>
+            </w:r>
+          </w:p>
+        </w:tc>
+      </w:tr>
+      <w:tr>
+        <w:tc>
+          <w:p>
+            <w:pPr>
+              <w:jc w:val="center"/>
+              <w:spacing w:before="60" w:after="60"/>
+            </w:pPr>
+            <w:r>
+              <w:rPr>
+                <w:rFonts w:ascii="Times New Roman" w:hAnsi="Times New Roman" w:cs="Times New Roman"/>
+                <w:sz w:val="24"/>
+              </w:rPr>
+              <w:t>Total</w:t>
+            </w:r>
+          </w:p>
+        </w:tc>
+        <w:tc>
+          <w:p>
+            <w:pPr>
+              <w:jc w:val="center"/>
+              <w:spacing w:before="60" w:after="60"/>
+            </w:pPr>
+            <w:r>
+              <w:rPr>
+                <w:rFonts w:ascii="Times New Roman" w:hAnsi="Times New Roman" w:cs="Times New Roman"/>
+                <w:sz w:val="24"/>
+              </w:rPr>
+              <w:t>3</w:t>
+            </w:r>
+          </w:p>
+        </w:tc>
+        <w:tc>
+          <w:p>
+            <w:pPr>
+              <w:jc w:val="center"/>
+              <w:spacing w:before="60" w:after="60"/>
+            </w:pPr>
+            <w:r>
+              <w:rPr>
+                <w:rFonts w:ascii="Times New Roman" w:hAnsi="Times New Roman" w:cs="Times New Roman"/>
+                <w:sz w:val="24"/>
+              </w:rPr>
+              <w:t>100%</w:t>
+            </w:r>
+          </w:p>
+        </w:tc>
+      </w:tr>
+    </w:tbl>
+    <w:p>
+      <w:pPr>
+        <w:spacing w:line="360" w:lineRule="auto" w:before="0" w:after="120"/>
+        <w:ind w:firstLine="0" w:left="0"/>
+        <w:jc w:val="left"/>
+      </w:pPr>
+      <w:r>
+        <w:rPr>
+          <w:rFonts w:ascii="Times New Roman" w:hAnsi="Times New Roman" w:cs="Times New Roman"/>
+          <w:b w:val="0"/>
+          <w:sz w:val="24"/>
+        </w:rPr>
+        <w:t>Fuente: Alvarado, L. (2026).</w:t>
+      </w:r>
+    </w:p>
+    <w:p>
+      <w:pPr>
+        <w:spacing w:line="360" w:lineRule="auto" w:before="0" w:after="120"/>
+        <w:ind w:firstLine="0" w:left="0"/>
+        <w:jc w:val="center"/>
+      </w:pPr>
+      <w:r>
+        <w:rPr>
+          <w:rFonts w:ascii="Times New Roman" w:hAnsi="Times New Roman" w:cs="Times New Roman"/>
+          <w:b/>
+          <w:sz w:val="24"/>
+        </w:rPr>
+        <w:t>[Insertar Gráfico 1 aquí: Eficiencia de la integración de datos en Excel]</w:t>
+      </w:r>
+    </w:p>
+    <w:p>
+      <w:pPr>
+        <w:spacing w:line="360" w:lineRule="auto" w:before="0" w:after="120"/>
+        <w:ind w:firstLine="0" w:left="0"/>
+        <w:jc w:val="left"/>
+      </w:pPr>
+      <w:r>
+        <w:rPr>
+          <w:rFonts w:ascii="Times New Roman" w:hAnsi="Times New Roman" w:cs="Times New Roman"/>
+          <w:b/>
+          <w:sz w:val="24"/>
+        </w:rPr>
+        <w:t>Análisis e Interpretación</w:t>
+      </w:r>
+    </w:p>
+    <w:p>
+      <w:pPr>
+        <w:spacing w:line="360" w:lineRule="auto" w:before="0" w:after="120"/>
+        <w:ind w:firstLine="720" w:left="0"/>
+        <w:jc w:val="both"/>
+      </w:pPr>
+      <w:r>
+        <w:rPr>
+          <w:rFonts w:ascii="Times New Roman" w:hAnsi="Times New Roman" w:cs="Times New Roman"/>
+          <w:b w:val="0"/>
+          <w:sz w:val="24"/>
+        </w:rPr>
+        <w:t>De acuerdo con los datos reflejados en el Cuadro 1, el 67% de la población encuestada (equivalente a dos empleados) considera que el estado actual de los archivos de Excel no permite una integración y cruce eficiente de los datos en la empresa Inversiones Más Por Tu Oro 17 C.A., mientras que el 33% restante (un empleado) considera que sí lo permite.</w:t>
+      </w:r>
+    </w:p>
+    <w:p>
+      <w:pPr>
+        <w:spacing w:line="360" w:lineRule="auto" w:before="0" w:after="120"/>
+        <w:ind w:firstLine="720" w:left="0"/>
+        <w:jc w:val="both"/>
+      </w:pPr>
+      <w:r>
+        <w:rPr>
+          <w:rFonts w:ascii="Times New Roman" w:hAnsi="Times New Roman" w:cs="Times New Roman"/>
+          <w:b w:val="0"/>
+          <w:sz w:val="24"/>
+        </w:rPr>
+        <w:t>Estos resultados evidencian una clara deficiencia en el manejo de la información bajo la modalidad de registro manual actual. Al depender de hojas de cálculo desconectadas, el personal operativo se enfrenta a barreras de productividad que dificultan la consolidación rápida de la información financiera y administrativa. Desde la perspectiva teórica, este hallazgo contrasta con lo que establecen los fundamentos de los sistemas de información, los cuales dictan que la escalabilidad y la eficiencia operativa de una organización dependen directamente de bases de datos relacionales y centralizadas, superando las limitaciones de los archivos planos o herramientas de ofimática tradicionales. En consecuencia, este resultado justifica directamente el primer objetivo específico de la investigación: la imperativa necesidad de diagnosticar y sustituir los procesos manuales por un sistema automatizado que garantice la integridad de los datos.</w:t>
+      </w:r>
+    </w:p>
+    <w:p>
+      <w:pPr>
+        <w:spacing w:line="360" w:lineRule="auto" w:before="0" w:after="120"/>
+        <w:ind w:firstLine="0" w:left="0"/>
+        <w:jc w:val="left"/>
+      </w:pPr>
+      <w:r>
+        <w:rPr>
+          <w:rFonts w:ascii="Times New Roman" w:hAnsi="Times New Roman" w:cs="Times New Roman"/>
+          <w:b/>
+          <w:sz w:val="24"/>
+        </w:rPr>
+        <w:t>Ítem 2. ¿El tiempo de respuesta manual afecta la productividad?</w:t>
+      </w:r>
+    </w:p>
+    <w:p>
+      <w:pPr>
+        <w:spacing w:line="360" w:lineRule="auto" w:before="0" w:after="120"/>
+        <w:ind w:firstLine="0" w:left="0"/>
+        <w:jc w:val="center"/>
+      </w:pPr>
+      <w:r>
+        <w:rPr>
+          <w:rFonts w:ascii="Times New Roman" w:hAnsi="Times New Roman" w:cs="Times New Roman"/>
+          <w:b w:val="0"/>
+          <w:sz w:val="24"/>
+        </w:rPr>
+        <w:t>Cuadro 2</w:t>
+        <w:br/>
+        <w:t>Impacto del tiempo de respuesta en la productividad</w:t>
+      </w:r>
+    </w:p>
+    <w:tbl>
+      <w:tblPr>
+        <w:tblBorders>
+          <w:top w:val="single" w:sz="4" w:space="0" w:color="000000"/>
+          <w:left w:val="single" w:sz="4" w:space="0" w:color="000000"/>
+          <w:bottom w:val="single" w:sz="4" w:space="0" w:color="000000"/>
+          <w:right w:val="single" w:sz="4" w:space="0" w:color="000000"/>
+          <w:insideH w:val="single" w:sz="4" w:space="0" w:color="000000"/>
+          <w:insideV w:val="single" w:sz="4" w:space="0" w:color="000000"/>
+        </w:tblBorders>
+        <w:tblW w:w="5000" w:type="pct"/>
+        <w:jc w:val="center"/>
+      </w:tblPr>
+      <w:tr>
+        <w:tc>
+          <w:p>
+            <w:pPr>
+              <w:jc w:val="center"/>
+              <w:spacing w:before="60" w:after="60"/>
+            </w:pPr>
+            <w:r>
+              <w:rPr>
+                <w:rFonts w:ascii="Times New Roman" w:hAnsi="Times New Roman" w:cs="Times New Roman"/>
+                <w:sz w:val="24"/>
+                <w:b/>
+              </w:rPr>
+              <w:t>Alternativa</w:t>
+            </w:r>
+          </w:p>
+        </w:tc>
+        <w:tc>
+          <w:p>
+            <w:pPr>
+              <w:jc w:val="center"/>
+              <w:spacing w:before="60" w:after="60"/>
+            </w:pPr>
+            <w:r>
+              <w:rPr>
+                <w:rFonts w:ascii="Times New Roman" w:hAnsi="Times New Roman" w:cs="Times New Roman"/>
+                <w:sz w:val="24"/>
+                <w:b/>
+              </w:rPr>
+              <w:t>Frecuencia Absoluta (ƒ)</w:t>
+            </w:r>
+          </w:p>
+        </w:tc>
+        <w:tc>
+          <w:p>
+            <w:pPr>
+              <w:jc w:val="center"/>
+              <w:spacing w:before="60" w:after="60"/>
+            </w:pPr>
+            <w:r>
+              <w:rPr>
+                <w:rFonts w:ascii="Times New Roman" w:hAnsi="Times New Roman" w:cs="Times New Roman"/>
+                <w:sz w:val="24"/>
+                <w:b/>
+              </w:rPr>
+              <w:t>Frecuencia Relativa (%)</w:t>
+            </w:r>
+          </w:p>
+        </w:tc>
+      </w:tr>
+      <w:tr>
+        <w:tc>
+          <w:p>
+            <w:pPr>
+              <w:jc w:val="center"/>
+              <w:spacing w:before="60" w:after="60"/>
+            </w:pPr>
+            <w:r>
+              <w:rPr>
+                <w:rFonts w:ascii="Times New Roman" w:hAnsi="Times New Roman" w:cs="Times New Roman"/>
+                <w:sz w:val="24"/>
+              </w:rPr>
+              <w:t>Sí</w:t>
+            </w:r>
+          </w:p>
+        </w:tc>
+        <w:tc>
+          <w:p>
+            <w:pPr>
+              <w:jc w:val="center"/>
+              <w:spacing w:before="60" w:after="60"/>
+            </w:pPr>
+            <w:r>
+              <w:rPr>
+                <w:rFonts w:ascii="Times New Roman" w:hAnsi="Times New Roman" w:cs="Times New Roman"/>
+                <w:sz w:val="24"/>
+              </w:rPr>
+              <w:t>3</w:t>
+            </w:r>
+          </w:p>
+        </w:tc>
+        <w:tc>
+          <w:p>
+            <w:pPr>
+              <w:jc w:val="center"/>
+              <w:spacing w:before="60" w:after="60"/>
+            </w:pPr>
+            <w:r>
+              <w:rPr>
+                <w:rFonts w:ascii="Times New Roman" w:hAnsi="Times New Roman" w:cs="Times New Roman"/>
+                <w:sz w:val="24"/>
+              </w:rPr>
+              <w:t>100%</w:t>
+            </w:r>
+          </w:p>
+        </w:tc>
+      </w:tr>
+      <w:tr>
+        <w:tc>
+          <w:p>
+            <w:pPr>
+              <w:jc w:val="center"/>
+              <w:spacing w:before="60" w:after="60"/>
+            </w:pPr>
+            <w:r>
+              <w:rPr>
+                <w:rFonts w:ascii="Times New Roman" w:hAnsi="Times New Roman" w:cs="Times New Roman"/>
+                <w:sz w:val="24"/>
+              </w:rPr>
+              <w:t>No</w:t>
+            </w:r>
+          </w:p>
+        </w:tc>
+        <w:tc>
+          <w:p>
+            <w:pPr>
+              <w:jc w:val="center"/>
+              <w:spacing w:before="60" w:after="60"/>
+            </w:pPr>
+            <w:r>
+              <w:rPr>
+                <w:rFonts w:ascii="Times New Roman" w:hAnsi="Times New Roman" w:cs="Times New Roman"/>
+                <w:sz w:val="24"/>
+              </w:rPr>
+              <w:t>0</w:t>
+            </w:r>
+          </w:p>
+        </w:tc>
+        <w:tc>
+          <w:p>
+            <w:pPr>
+              <w:jc w:val="center"/>
+              <w:spacing w:before="60" w:after="60"/>
+            </w:pPr>
+            <w:r>
+              <w:rPr>
+                <w:rFonts w:ascii="Times New Roman" w:hAnsi="Times New Roman" w:cs="Times New Roman"/>
+                <w:sz w:val="24"/>
+              </w:rPr>
+              <w:t>0%</w:t>
+            </w:r>
+          </w:p>
+        </w:tc>
+      </w:tr>
+      <w:tr>
+        <w:tc>
+          <w:p>
+            <w:pPr>
+              <w:jc w:val="center"/>
+              <w:spacing w:before="60" w:after="60"/>
+            </w:pPr>
+            <w:r>
+              <w:rPr>
+                <w:rFonts w:ascii="Times New Roman" w:hAnsi="Times New Roman" w:cs="Times New Roman"/>
+                <w:sz w:val="24"/>
+              </w:rPr>
+              <w:t>Total</w:t>
+            </w:r>
+          </w:p>
+        </w:tc>
+        <w:tc>
+          <w:p>
+            <w:pPr>
+              <w:jc w:val="center"/>
+              <w:spacing w:before="60" w:after="60"/>
+            </w:pPr>
+            <w:r>
+              <w:rPr>
+                <w:rFonts w:ascii="Times New Roman" w:hAnsi="Times New Roman" w:cs="Times New Roman"/>
+                <w:sz w:val="24"/>
+              </w:rPr>
+              <w:t>3</w:t>
+            </w:r>
+          </w:p>
+        </w:tc>
+        <w:tc>
+          <w:p>
+            <w:pPr>
+              <w:jc w:val="center"/>
+              <w:spacing w:before="60" w:after="60"/>
+            </w:pPr>
+            <w:r>
+              <w:rPr>
+                <w:rFonts w:ascii="Times New Roman" w:hAnsi="Times New Roman" w:cs="Times New Roman"/>
+                <w:sz w:val="24"/>
+              </w:rPr>
+              <w:t>100%</w:t>
+            </w:r>
+          </w:p>
+        </w:tc>
+      </w:tr>
+    </w:tbl>
+    <w:p>
+      <w:pPr>
+        <w:spacing w:line="360" w:lineRule="auto" w:before="0" w:after="120"/>
+        <w:ind w:firstLine="0" w:left="0"/>
+        <w:jc w:val="left"/>
+      </w:pPr>
+      <w:r>
+        <w:rPr>
+          <w:rFonts w:ascii="Times New Roman" w:hAnsi="Times New Roman" w:cs="Times New Roman"/>
+          <w:b w:val="0"/>
+          <w:sz w:val="24"/>
+        </w:rPr>
+        <w:t>Fuente: Alvarado, L. (2026).</w:t>
+      </w:r>
+    </w:p>
+    <w:p>
+      <w:pPr>
+        <w:spacing w:line="360" w:lineRule="auto" w:before="0" w:after="120"/>
+        <w:ind w:firstLine="0" w:left="0"/>
+        <w:jc w:val="center"/>
+      </w:pPr>
+      <w:r>
+        <w:rPr>
+          <w:rFonts w:ascii="Times New Roman" w:hAnsi="Times New Roman" w:cs="Times New Roman"/>
+          <w:b/>
+          <w:sz w:val="24"/>
+        </w:rPr>
+        <w:t>[Insertar Gráfico 2 aquí: Impacto del tiempo de respuesta en la productividad]</w:t>
+      </w:r>
+    </w:p>
+    <w:p>
+      <w:pPr>
+        <w:spacing w:line="360" w:lineRule="auto" w:before="0" w:after="120"/>
+        <w:ind w:firstLine="0" w:left="0"/>
+        <w:jc w:val="left"/>
+      </w:pPr>
+      <w:r>
+        <w:rPr>
+          <w:rFonts w:ascii="Times New Roman" w:hAnsi="Times New Roman" w:cs="Times New Roman"/>
+          <w:b/>
+          <w:sz w:val="24"/>
+        </w:rPr>
+        <w:t>Análisis e Interpretación</w:t>
+      </w:r>
+    </w:p>
+    <w:p>
+      <w:pPr>
+        <w:spacing w:line="360" w:lineRule="auto" w:before="0" w:after="120"/>
+        <w:ind w:firstLine="720" w:left="0"/>
+        <w:jc w:val="both"/>
+      </w:pPr>
+      <w:r>
+        <w:rPr>
+          <w:rFonts w:ascii="Times New Roman" w:hAnsi="Times New Roman" w:cs="Times New Roman"/>
+          <w:b w:val="0"/>
+          <w:sz w:val="24"/>
+        </w:rPr>
+        <w:t>De acuerdo con los datos reflejados en el Cuadro 2, el 100% de la población encuestada considera que el tiempo de respuesta bajo la modalidad manual actual afecta negativamente la productividad diaria. Este resultado demuestra un consenso absoluto sobre los cuellos de botella generados por la dependencia de procesos no automatizados.</w:t>
+      </w:r>
+    </w:p>
+    <w:p>
+      <w:pPr>
+        <w:spacing w:line="360" w:lineRule="auto" w:before="0" w:after="120"/>
+        <w:ind w:firstLine="720" w:left="0"/>
+        <w:jc w:val="both"/>
+      </w:pPr>
+      <w:r>
+        <w:rPr>
+          <w:rFonts w:ascii="Times New Roman" w:hAnsi="Times New Roman" w:cs="Times New Roman"/>
+          <w:b w:val="0"/>
+          <w:sz w:val="24"/>
+        </w:rPr>
+        <w:t>Desde una perspectiva teórica, este hallazgo concuerda con lo expuesto por Kendall y Kendall (2011), quienes afirman que la automatización de procesos mediante sistemas de información es fundamental para agilizar las operaciones y eliminar las latencias inherentes a las tareas manuales. En el contexto de Inversiones Más Por Tu Oro 17 C.A., este resultado justifica la necesidad inminente de desarrollar módulos de atención y registro ágiles que maximicen la productividad de la gerencia y el personal operativo.</w:t>
+      </w:r>
+    </w:p>
+    <w:p>
+      <w:pPr>
+        <w:spacing w:line="360" w:lineRule="auto" w:before="0" w:after="120"/>
+        <w:ind w:firstLine="0" w:left="0"/>
+        <w:jc w:val="left"/>
+      </w:pPr>
+      <w:r>
+        <w:rPr>
+          <w:rFonts w:ascii="Times New Roman" w:hAnsi="Times New Roman" w:cs="Times New Roman"/>
+          <w:b/>
+          <w:sz w:val="24"/>
+        </w:rPr>
+        <w:t>Ítem 3. ¿Se han registrado discrepancias o inconsistencias en los cálculos de intereses y fechas de vencimiento bajo la modalidad manual?</w:t>
+      </w:r>
+    </w:p>
+    <w:p>
+      <w:pPr>
+        <w:spacing w:line="360" w:lineRule="auto" w:before="0" w:after="120"/>
+        <w:ind w:firstLine="0" w:left="0"/>
+        <w:jc w:val="center"/>
+      </w:pPr>
+      <w:r>
+        <w:rPr>
+          <w:rFonts w:ascii="Times New Roman" w:hAnsi="Times New Roman" w:cs="Times New Roman"/>
+          <w:b w:val="0"/>
+          <w:sz w:val="24"/>
+        </w:rPr>
+        <w:t>Cuadro 3</w:t>
+        <w:br/>
+        <w:t>Inconsistencias en cálculos de intereses y fechas</w:t>
+      </w:r>
+    </w:p>
+    <w:tbl>
+      <w:tblPr>
+        <w:tblBorders>
+          <w:top w:val="single" w:sz="4" w:space="0" w:color="000000"/>
+          <w:left w:val="single" w:sz="4" w:space="0" w:color="000000"/>
+          <w:bottom w:val="single" w:sz="4" w:space="0" w:color="000000"/>
+          <w:right w:val="single" w:sz="4" w:space="0" w:color="000000"/>
+          <w:insideH w:val="single" w:sz="4" w:space="0" w:color="000000"/>
+          <w:insideV w:val="single" w:sz="4" w:space="0" w:color="000000"/>
+        </w:tblBorders>
+        <w:tblW w:w="5000" w:type="pct"/>
+        <w:jc w:val="center"/>
+      </w:tblPr>
+      <w:tr>
+        <w:tc>
+          <w:p>
+            <w:pPr>
+              <w:jc w:val="center"/>
+              <w:spacing w:before="60" w:after="60"/>
+            </w:pPr>
+            <w:r>
+              <w:rPr>
+                <w:rFonts w:ascii="Times New Roman" w:hAnsi="Times New Roman" w:cs="Times New Roman"/>
+                <w:sz w:val="24"/>
+                <w:b/>
+              </w:rPr>
+              <w:t>Alternativa</w:t>
+            </w:r>
+          </w:p>
+        </w:tc>
+        <w:tc>
+          <w:p>
+            <w:pPr>
+              <w:jc w:val="center"/>
+              <w:spacing w:before="60" w:after="60"/>
+            </w:pPr>
+            <w:r>
+              <w:rPr>
+                <w:rFonts w:ascii="Times New Roman" w:hAnsi="Times New Roman" w:cs="Times New Roman"/>
+                <w:sz w:val="24"/>
+                <w:b/>
+              </w:rPr>
+              <w:t>Frecuencia Absoluta (ƒ)</w:t>
+            </w:r>
+          </w:p>
+        </w:tc>
+        <w:tc>
+          <w:p>
+            <w:pPr>
+              <w:jc w:val="center"/>
+              <w:spacing w:before="60" w:after="60"/>
+            </w:pPr>
+            <w:r>
+              <w:rPr>
+                <w:rFonts w:ascii="Times New Roman" w:hAnsi="Times New Roman" w:cs="Times New Roman"/>
+                <w:sz w:val="24"/>
+                <w:b/>
+              </w:rPr>
+              <w:t>Frecuencia Relativa (%)</w:t>
+            </w:r>
+          </w:p>
+        </w:tc>
+      </w:tr>
+      <w:tr>
+        <w:tc>
+          <w:p>
+            <w:pPr>
+              <w:jc w:val="center"/>
+              <w:spacing w:before="60" w:after="60"/>
+            </w:pPr>
+            <w:r>
+              <w:rPr>
+                <w:rFonts w:ascii="Times New Roman" w:hAnsi="Times New Roman" w:cs="Times New Roman"/>
+                <w:sz w:val="24"/>
+              </w:rPr>
+              <w:t>Sí</w:t>
+            </w:r>
+          </w:p>
+        </w:tc>
+        <w:tc>
+          <w:p>
+            <w:pPr>
+              <w:jc w:val="center"/>
+              <w:spacing w:before="60" w:after="60"/>
+            </w:pPr>
+            <w:r>
+              <w:rPr>
+                <w:rFonts w:ascii="Times New Roman" w:hAnsi="Times New Roman" w:cs="Times New Roman"/>
+                <w:sz w:val="24"/>
+              </w:rPr>
+              <w:t>3</w:t>
+            </w:r>
+          </w:p>
+        </w:tc>
+        <w:tc>
+          <w:p>
+            <w:pPr>
+              <w:jc w:val="center"/>
+              <w:spacing w:before="60" w:after="60"/>
+            </w:pPr>
+            <w:r>
+              <w:rPr>
+                <w:rFonts w:ascii="Times New Roman" w:hAnsi="Times New Roman" w:cs="Times New Roman"/>
+                <w:sz w:val="24"/>
+              </w:rPr>
+              <w:t>100%</w:t>
+            </w:r>
+          </w:p>
+        </w:tc>
+      </w:tr>
+      <w:tr>
+        <w:tc>
+          <w:p>
+            <w:pPr>
+              <w:jc w:val="center"/>
+              <w:spacing w:before="60" w:after="60"/>
+            </w:pPr>
+            <w:r>
+              <w:rPr>
+                <w:rFonts w:ascii="Times New Roman" w:hAnsi="Times New Roman" w:cs="Times New Roman"/>
+                <w:sz w:val="24"/>
+              </w:rPr>
+              <w:t>No</w:t>
+            </w:r>
+          </w:p>
+        </w:tc>
+        <w:tc>
+          <w:p>
+            <w:pPr>
+              <w:jc w:val="center"/>
+              <w:spacing w:before="60" w:after="60"/>
+            </w:pPr>
+            <w:r>
+              <w:rPr>
+                <w:rFonts w:ascii="Times New Roman" w:hAnsi="Times New Roman" w:cs="Times New Roman"/>
+                <w:sz w:val="24"/>
+              </w:rPr>
+              <w:t>0</w:t>
+            </w:r>
+          </w:p>
+        </w:tc>
+        <w:tc>
+          <w:p>
+            <w:pPr>
+              <w:jc w:val="center"/>
+              <w:spacing w:before="60" w:after="60"/>
+            </w:pPr>
+            <w:r>
+              <w:rPr>
+                <w:rFonts w:ascii="Times New Roman" w:hAnsi="Times New Roman" w:cs="Times New Roman"/>
+                <w:sz w:val="24"/>
+              </w:rPr>
+              <w:t>0%</w:t>
+            </w:r>
+          </w:p>
+        </w:tc>
+      </w:tr>
+      <w:tr>
+        <w:tc>
+          <w:p>
+            <w:pPr>
+              <w:jc w:val="center"/>
+              <w:spacing w:before="60" w:after="60"/>
+            </w:pPr>
+            <w:r>
+              <w:rPr>
+                <w:rFonts w:ascii="Times New Roman" w:hAnsi="Times New Roman" w:cs="Times New Roman"/>
+                <w:sz w:val="24"/>
+              </w:rPr>
+              <w:t>Total</w:t>
+            </w:r>
+          </w:p>
+        </w:tc>
+        <w:tc>
+          <w:p>
+            <w:pPr>
+              <w:jc w:val="center"/>
+              <w:spacing w:before="60" w:after="60"/>
+            </w:pPr>
+            <w:r>
+              <w:rPr>
+                <w:rFonts w:ascii="Times New Roman" w:hAnsi="Times New Roman" w:cs="Times New Roman"/>
+                <w:sz w:val="24"/>
+              </w:rPr>
+              <w:t>3</w:t>
+            </w:r>
+          </w:p>
+        </w:tc>
+        <w:tc>
+          <w:p>
+            <w:pPr>
+              <w:jc w:val="center"/>
+              <w:spacing w:before="60" w:after="60"/>
+            </w:pPr>
+            <w:r>
+              <w:rPr>
+                <w:rFonts w:ascii="Times New Roman" w:hAnsi="Times New Roman" w:cs="Times New Roman"/>
+                <w:sz w:val="24"/>
+              </w:rPr>
+              <w:t>100%</w:t>
+            </w:r>
+          </w:p>
+        </w:tc>
+      </w:tr>
+    </w:tbl>
+    <w:p>
+      <w:pPr>
+        <w:spacing w:line="360" w:lineRule="auto" w:before="0" w:after="120"/>
+        <w:ind w:firstLine="0" w:left="0"/>
+        <w:jc w:val="left"/>
+      </w:pPr>
+      <w:r>
+        <w:rPr>
+          <w:rFonts w:ascii="Times New Roman" w:hAnsi="Times New Roman" w:cs="Times New Roman"/>
+          <w:b w:val="0"/>
+          <w:sz w:val="24"/>
+        </w:rPr>
+        <w:t>Fuente: Alvarado, L. (2026).</w:t>
+      </w:r>
+    </w:p>
+    <w:p>
+      <w:pPr>
+        <w:spacing w:line="360" w:lineRule="auto" w:before="0" w:after="120"/>
+        <w:ind w:firstLine="0" w:left="0"/>
+        <w:jc w:val="center"/>
+      </w:pPr>
+      <w:r>
+        <w:rPr>
+          <w:rFonts w:ascii="Times New Roman" w:hAnsi="Times New Roman" w:cs="Times New Roman"/>
+          <w:b/>
+          <w:sz w:val="24"/>
+        </w:rPr>
+        <w:t>[Insertar Gráfico 3 aquí: Inconsistencias en cálculos de intereses y fechas]</w:t>
+      </w:r>
+    </w:p>
+    <w:p>
+      <w:pPr>
+        <w:spacing w:line="360" w:lineRule="auto" w:before="0" w:after="120"/>
+        <w:ind w:firstLine="0" w:left="0"/>
+        <w:jc w:val="left"/>
+      </w:pPr>
+      <w:r>
+        <w:rPr>
+          <w:rFonts w:ascii="Times New Roman" w:hAnsi="Times New Roman" w:cs="Times New Roman"/>
+          <w:b/>
+          <w:sz w:val="24"/>
+        </w:rPr>
+        <w:t>Análisis e Interpretación</w:t>
+      </w:r>
+    </w:p>
+    <w:p>
+      <w:pPr>
+        <w:spacing w:line="360" w:lineRule="auto" w:before="0" w:after="120"/>
+        <w:ind w:firstLine="720" w:left="0"/>
+        <w:jc w:val="both"/>
+      </w:pPr>
+      <w:r>
+        <w:rPr>
+          <w:rFonts w:ascii="Times New Roman" w:hAnsi="Times New Roman" w:cs="Times New Roman"/>
+          <w:b w:val="0"/>
+          <w:sz w:val="24"/>
+        </w:rPr>
+        <w:t>El Cuadro 3 muestra que la totalidad de los encuestados (100%) ha registrado discrepancias o inconsistencias en los cálculos de intereses y fechas de vencimiento al utilizar el modelo de trabajo actual. Esta homogeneidad en las respuestas subraya una vulnerabilidad crítica en la exactitud financiera de la empresa.</w:t>
+      </w:r>
+    </w:p>
+    <w:p>
+      <w:pPr>
+        <w:spacing w:line="360" w:lineRule="auto" w:before="0" w:after="120"/>
+        <w:ind w:firstLine="720" w:left="0"/>
+        <w:jc w:val="both"/>
+      </w:pPr>
+      <w:r>
+        <w:rPr>
+          <w:rFonts w:ascii="Times New Roman" w:hAnsi="Times New Roman" w:cs="Times New Roman"/>
+          <w:b w:val="0"/>
+          <w:sz w:val="24"/>
+        </w:rPr>
+        <w:t>Como señala Date (2004), los sistemas de bases de datos relacionales son esenciales para garantizar la consistencia y la integridad referencial de la información, previniendo los errores de cálculo humano y la sobreescritura accidental. Para el control de préstamos prendarios, donde la precisión de las tasas de interés es vital, la ausencia de un algoritmo de cálculo automatizado representa un riesgo operativo que el nuevo sistema propuesto logrará mitigar estructuralmente.</w:t>
+      </w:r>
+    </w:p>
+    <w:p>
+      <w:pPr>
+        <w:spacing w:line="360" w:lineRule="auto" w:before="0" w:after="120"/>
+        <w:ind w:firstLine="0" w:left="0"/>
+        <w:jc w:val="left"/>
+      </w:pPr>
+      <w:r>
+        <w:rPr>
+          <w:rFonts w:ascii="Times New Roman" w:hAnsi="Times New Roman" w:cs="Times New Roman"/>
+          <w:b/>
+          <w:sz w:val="24"/>
+        </w:rPr>
+        <w:t>Ítem 4. ¿Dispone la empresa de mecanismos automatizados de respaldo para proteger la información frente a fallos del sistema o sobreescrituras?</w:t>
+      </w:r>
+    </w:p>
+    <w:p>
+      <w:pPr>
+        <w:spacing w:line="360" w:lineRule="auto" w:before="0" w:after="120"/>
+        <w:ind w:firstLine="0" w:left="0"/>
+        <w:jc w:val="center"/>
+      </w:pPr>
+      <w:r>
+        <w:rPr>
+          <w:rFonts w:ascii="Times New Roman" w:hAnsi="Times New Roman" w:cs="Times New Roman"/>
+          <w:b w:val="0"/>
+          <w:sz w:val="24"/>
+        </w:rPr>
+        <w:t>Cuadro 4</w:t>
+        <w:br/>
+        <w:t>Mecanismos automatizados de respaldo de información</w:t>
+      </w:r>
+    </w:p>
+    <w:tbl>
+      <w:tblPr>
+        <w:tblBorders>
+          <w:top w:val="single" w:sz="4" w:space="0" w:color="000000"/>
+          <w:left w:val="single" w:sz="4" w:space="0" w:color="000000"/>
+          <w:bottom w:val="single" w:sz="4" w:space="0" w:color="000000"/>
+          <w:right w:val="single" w:sz="4" w:space="0" w:color="000000"/>
+          <w:insideH w:val="single" w:sz="4" w:space="0" w:color="000000"/>
+          <w:insideV w:val="single" w:sz="4" w:space="0" w:color="000000"/>
+        </w:tblBorders>
+        <w:tblW w:w="5000" w:type="pct"/>
+        <w:jc w:val="center"/>
+      </w:tblPr>
+      <w:tr>
+        <w:tc>
+          <w:p>
+            <w:pPr>
+              <w:jc w:val="center"/>
+              <w:spacing w:before="60" w:after="60"/>
+            </w:pPr>
+            <w:r>
+              <w:rPr>
+                <w:rFonts w:ascii="Times New Roman" w:hAnsi="Times New Roman" w:cs="Times New Roman"/>
+                <w:sz w:val="24"/>
+                <w:b/>
+              </w:rPr>
+              <w:t>Alternativa</w:t>
+            </w:r>
+          </w:p>
+        </w:tc>
+        <w:tc>
+          <w:p>
+            <w:pPr>
+              <w:jc w:val="center"/>
+              <w:spacing w:before="60" w:after="60"/>
+            </w:pPr>
+            <w:r>
+              <w:rPr>
+                <w:rFonts w:ascii="Times New Roman" w:hAnsi="Times New Roman" w:cs="Times New Roman"/>
+                <w:sz w:val="24"/>
+                <w:b/>
+              </w:rPr>
+              <w:t>Frecuencia Absoluta (ƒ)</w:t>
+            </w:r>
+          </w:p>
+        </w:tc>
+        <w:tc>
+          <w:p>
+            <w:pPr>
+              <w:jc w:val="center"/>
+              <w:spacing w:before="60" w:after="60"/>
+            </w:pPr>
+            <w:r>
+              <w:rPr>
+                <w:rFonts w:ascii="Times New Roman" w:hAnsi="Times New Roman" w:cs="Times New Roman"/>
+                <w:sz w:val="24"/>
+                <w:b/>
+              </w:rPr>
+              <w:t>Frecuencia Relativa (%)</w:t>
+            </w:r>
+          </w:p>
+        </w:tc>
+      </w:tr>
+      <w:tr>
+        <w:tc>
+          <w:p>
+            <w:pPr>
+              <w:jc w:val="center"/>
+              <w:spacing w:before="60" w:after="60"/>
+            </w:pPr>
+            <w:r>
+              <w:rPr>
+                <w:rFonts w:ascii="Times New Roman" w:hAnsi="Times New Roman" w:cs="Times New Roman"/>
+                <w:sz w:val="24"/>
+              </w:rPr>
+              <w:t>Sí</w:t>
+            </w:r>
+          </w:p>
+        </w:tc>
+        <w:tc>
+          <w:p>
+            <w:pPr>
+              <w:jc w:val="center"/>
+              <w:spacing w:before="60" w:after="60"/>
+            </w:pPr>
+            <w:r>
+              <w:rPr>
+                <w:rFonts w:ascii="Times New Roman" w:hAnsi="Times New Roman" w:cs="Times New Roman"/>
+                <w:sz w:val="24"/>
+              </w:rPr>
+              <w:t>0</w:t>
+            </w:r>
+          </w:p>
+        </w:tc>
+        <w:tc>
+          <w:p>
+            <w:pPr>
+              <w:jc w:val="center"/>
+              <w:spacing w:before="60" w:after="60"/>
+            </w:pPr>
+            <w:r>
+              <w:rPr>
+                <w:rFonts w:ascii="Times New Roman" w:hAnsi="Times New Roman" w:cs="Times New Roman"/>
+                <w:sz w:val="24"/>
+              </w:rPr>
+              <w:t>0%</w:t>
+            </w:r>
+          </w:p>
+        </w:tc>
+      </w:tr>
+      <w:tr>
+        <w:tc>
+          <w:p>
+            <w:pPr>
+              <w:jc w:val="center"/>
+              <w:spacing w:before="60" w:after="60"/>
+            </w:pPr>
+            <w:r>
+              <w:rPr>
+                <w:rFonts w:ascii="Times New Roman" w:hAnsi="Times New Roman" w:cs="Times New Roman"/>
+                <w:sz w:val="24"/>
+              </w:rPr>
+              <w:t>No</w:t>
+            </w:r>
+          </w:p>
+        </w:tc>
+        <w:tc>
+          <w:p>
+            <w:pPr>
+              <w:jc w:val="center"/>
+              <w:spacing w:before="60" w:after="60"/>
+            </w:pPr>
+            <w:r>
+              <w:rPr>
+                <w:rFonts w:ascii="Times New Roman" w:hAnsi="Times New Roman" w:cs="Times New Roman"/>
+                <w:sz w:val="24"/>
+              </w:rPr>
+              <w:t>3</w:t>
+            </w:r>
+          </w:p>
+        </w:tc>
+        <w:tc>
+          <w:p>
+            <w:pPr>
+              <w:jc w:val="center"/>
+              <w:spacing w:before="60" w:after="60"/>
+            </w:pPr>
+            <w:r>
+              <w:rPr>
+                <w:rFonts w:ascii="Times New Roman" w:hAnsi="Times New Roman" w:cs="Times New Roman"/>
+                <w:sz w:val="24"/>
+              </w:rPr>
+              <w:t>100%</w:t>
+            </w:r>
+          </w:p>
+        </w:tc>
+      </w:tr>
+      <w:tr>
+        <w:tc>
+          <w:p>
+            <w:pPr>
+              <w:jc w:val="center"/>
+              <w:spacing w:before="60" w:after="60"/>
+            </w:pPr>
+            <w:r>
+              <w:rPr>
+                <w:rFonts w:ascii="Times New Roman" w:hAnsi="Times New Roman" w:cs="Times New Roman"/>
+                <w:sz w:val="24"/>
+              </w:rPr>
+              <w:t>Total</w:t>
+            </w:r>
+          </w:p>
+        </w:tc>
+        <w:tc>
+          <w:p>
+            <w:pPr>
+              <w:jc w:val="center"/>
+              <w:spacing w:before="60" w:after="60"/>
+            </w:pPr>
+            <w:r>
+              <w:rPr>
+                <w:rFonts w:ascii="Times New Roman" w:hAnsi="Times New Roman" w:cs="Times New Roman"/>
+                <w:sz w:val="24"/>
+              </w:rPr>
+              <w:t>3</w:t>
+            </w:r>
+          </w:p>
+        </w:tc>
+        <w:tc>
+          <w:p>
+            <w:pPr>
+              <w:jc w:val="center"/>
+              <w:spacing w:before="60" w:after="60"/>
+            </w:pPr>
+            <w:r>
+              <w:rPr>
+                <w:rFonts w:ascii="Times New Roman" w:hAnsi="Times New Roman" w:cs="Times New Roman"/>
+                <w:sz w:val="24"/>
+              </w:rPr>
+              <w:t>100%</w:t>
+            </w:r>
+          </w:p>
+        </w:tc>
+      </w:tr>
+    </w:tbl>
+    <w:p>
+      <w:pPr>
+        <w:spacing w:line="360" w:lineRule="auto" w:before="0" w:after="120"/>
+        <w:ind w:firstLine="0" w:left="0"/>
+        <w:jc w:val="left"/>
+      </w:pPr>
+      <w:r>
+        <w:rPr>
+          <w:rFonts w:ascii="Times New Roman" w:hAnsi="Times New Roman" w:cs="Times New Roman"/>
+          <w:b w:val="0"/>
+          <w:sz w:val="24"/>
+        </w:rPr>
+        <w:t>Fuente: Alvarado, L. (2026).</w:t>
+      </w:r>
+    </w:p>
+    <w:p>
+      <w:pPr>
+        <w:spacing w:line="360" w:lineRule="auto" w:before="0" w:after="120"/>
+        <w:ind w:firstLine="0" w:left="0"/>
+        <w:jc w:val="center"/>
+      </w:pPr>
+      <w:r>
+        <w:rPr>
+          <w:rFonts w:ascii="Times New Roman" w:hAnsi="Times New Roman" w:cs="Times New Roman"/>
+          <w:b/>
+          <w:sz w:val="24"/>
+        </w:rPr>
+        <w:t>[Insertar Gráfico 4 aquí: Mecanismos automatizados de respaldo de información]</w:t>
+      </w:r>
+    </w:p>
+    <w:p>
+      <w:pPr>
+        <w:spacing w:line="360" w:lineRule="auto" w:before="0" w:after="120"/>
+        <w:ind w:firstLine="0" w:left="0"/>
+        <w:jc w:val="left"/>
+      </w:pPr>
+      <w:r>
+        <w:rPr>
+          <w:rFonts w:ascii="Times New Roman" w:hAnsi="Times New Roman" w:cs="Times New Roman"/>
+          <w:b/>
+          <w:sz w:val="24"/>
+        </w:rPr>
+        <w:t>Análisis e Interpretación</w:t>
+      </w:r>
+    </w:p>
+    <w:p>
+      <w:pPr>
+        <w:spacing w:line="360" w:lineRule="auto" w:before="0" w:after="120"/>
+        <w:ind w:firstLine="720" w:left="0"/>
+        <w:jc w:val="both"/>
+      </w:pPr>
+      <w:r>
+        <w:rPr>
+          <w:rFonts w:ascii="Times New Roman" w:hAnsi="Times New Roman" w:cs="Times New Roman"/>
+          <w:b w:val="0"/>
+          <w:sz w:val="24"/>
+        </w:rPr>
+        <w:t>Como se observa en el Cuadro 4, el 100% de la muestra afirma contundentemente que la empresa no dispone en la actualidad de mecanismos automatizados de respaldo para proteger sus datos financieros y operativos frente a fallos o sobreescrituras. Este diagnóstico revela una deficiencia severa en los protocolos de seguridad de la información.</w:t>
+      </w:r>
+    </w:p>
+    <w:p>
+      <w:pPr>
+        <w:spacing w:line="360" w:lineRule="auto" w:before="0" w:after="120"/>
+        <w:ind w:firstLine="720" w:left="0"/>
+        <w:jc w:val="both"/>
+      </w:pPr>
+      <w:r>
+        <w:rPr>
+          <w:rFonts w:ascii="Times New Roman" w:hAnsi="Times New Roman" w:cs="Times New Roman"/>
+          <w:b w:val="0"/>
+          <w:sz w:val="24"/>
+        </w:rPr>
+        <w:t>De acuerdo con los lineamientos de seguridad y privacidad, las organizaciones deben velar por la integridad y resguardo de sus activos de información crítica. La carencia absoluta de respaldos justifica plenamente la arquitectura del sistema propuesto, el cual incluirá rutinas automatizadas de salvaguarda de la base de datos relacional, protegiendo así los registros de empeños y el inventario físico de metales preciosos ante cualquier contingencia técnica.</w:t>
+      </w:r>
+    </w:p>
+    <w:p>
+      <w:pPr>
+        <w:spacing w:line="360" w:lineRule="auto" w:before="0" w:after="120"/>
+        <w:ind w:firstLine="0" w:left="0"/>
+        <w:jc w:val="left"/>
+      </w:pPr>
+      <w:r>
+        <w:rPr>
+          <w:rFonts w:ascii="Times New Roman" w:hAnsi="Times New Roman" w:cs="Times New Roman"/>
+          <w:b/>
+          <w:sz w:val="24"/>
+        </w:rPr>
+        <w:t>Ítem 5. ¿Es fundamental un sistema centralizado para la trazabilidad?</w:t>
+      </w:r>
+    </w:p>
+    <w:p>
+      <w:pPr>
+        <w:spacing w:line="360" w:lineRule="auto" w:before="0" w:after="120"/>
+        <w:ind w:firstLine="0" w:left="0"/>
+        <w:jc w:val="center"/>
+      </w:pPr>
+      <w:r>
+        <w:rPr>
+          <w:rFonts w:ascii="Times New Roman" w:hAnsi="Times New Roman" w:cs="Times New Roman"/>
+          <w:b w:val="0"/>
+          <w:sz w:val="24"/>
+        </w:rPr>
+        <w:t>Cuadro 5</w:t>
+        <w:br/>
+        <w:t>Importancia de un sistema centralizado para trazabilidad</w:t>
+      </w:r>
+    </w:p>
+    <w:tbl>
+      <w:tblPr>
+        <w:tblBorders>
+          <w:top w:val="single" w:sz="4" w:space="0" w:color="000000"/>
+          <w:left w:val="single" w:sz="4" w:space="0" w:color="000000"/>
+          <w:bottom w:val="single" w:sz="4" w:space="0" w:color="000000"/>
+          <w:right w:val="single" w:sz="4" w:space="0" w:color="000000"/>
+          <w:insideH w:val="single" w:sz="4" w:space="0" w:color="000000"/>
+          <w:insideV w:val="single" w:sz="4" w:space="0" w:color="000000"/>
+        </w:tblBorders>
+        <w:tblW w:w="5000" w:type="pct"/>
+        <w:jc w:val="center"/>
+      </w:tblPr>
+      <w:tr>
+        <w:tc>
+          <w:p>
+            <w:pPr>
+              <w:jc w:val="center"/>
+              <w:spacing w:before="60" w:after="60"/>
+            </w:pPr>
+            <w:r>
+              <w:rPr>
+                <w:rFonts w:ascii="Times New Roman" w:hAnsi="Times New Roman" w:cs="Times New Roman"/>
+                <w:sz w:val="24"/>
+                <w:b/>
+              </w:rPr>
+              <w:t>Alternativa</w:t>
+            </w:r>
+          </w:p>
+        </w:tc>
+        <w:tc>
+          <w:p>
+            <w:pPr>
+              <w:jc w:val="center"/>
+              <w:spacing w:before="60" w:after="60"/>
+            </w:pPr>
+            <w:r>
+              <w:rPr>
+                <w:rFonts w:ascii="Times New Roman" w:hAnsi="Times New Roman" w:cs="Times New Roman"/>
+                <w:sz w:val="24"/>
+                <w:b/>
+              </w:rPr>
+              <w:t>Frecuencia Absoluta (ƒ)</w:t>
+            </w:r>
+          </w:p>
+        </w:tc>
+        <w:tc>
+          <w:p>
+            <w:pPr>
+              <w:jc w:val="center"/>
+              <w:spacing w:before="60" w:after="60"/>
+            </w:pPr>
+            <w:r>
+              <w:rPr>
+                <w:rFonts w:ascii="Times New Roman" w:hAnsi="Times New Roman" w:cs="Times New Roman"/>
+                <w:sz w:val="24"/>
+                <w:b/>
+              </w:rPr>
+              <w:t>Frecuencia Relativa (%)</w:t>
+            </w:r>
+          </w:p>
+        </w:tc>
+      </w:tr>
+      <w:tr>
+        <w:tc>
+          <w:p>
+            <w:pPr>
+              <w:jc w:val="center"/>
+              <w:spacing w:before="60" w:after="60"/>
+            </w:pPr>
+            <w:r>
+              <w:rPr>
+                <w:rFonts w:ascii="Times New Roman" w:hAnsi="Times New Roman" w:cs="Times New Roman"/>
+                <w:sz w:val="24"/>
+              </w:rPr>
+              <w:t>Sí</w:t>
+            </w:r>
+          </w:p>
+        </w:tc>
+        <w:tc>
+          <w:p>
+            <w:pPr>
+              <w:jc w:val="center"/>
+              <w:spacing w:before="60" w:after="60"/>
+            </w:pPr>
+            <w:r>
+              <w:rPr>
+                <w:rFonts w:ascii="Times New Roman" w:hAnsi="Times New Roman" w:cs="Times New Roman"/>
+                <w:sz w:val="24"/>
+              </w:rPr>
+              <w:t>3</w:t>
+            </w:r>
+          </w:p>
+        </w:tc>
+        <w:tc>
+          <w:p>
+            <w:pPr>
+              <w:jc w:val="center"/>
+              <w:spacing w:before="60" w:after="60"/>
+            </w:pPr>
+            <w:r>
+              <w:rPr>
+                <w:rFonts w:ascii="Times New Roman" w:hAnsi="Times New Roman" w:cs="Times New Roman"/>
+                <w:sz w:val="24"/>
+              </w:rPr>
+              <w:t>100%</w:t>
+            </w:r>
+          </w:p>
+        </w:tc>
+      </w:tr>
+      <w:tr>
+        <w:tc>
+          <w:p>
+            <w:pPr>
+              <w:jc w:val="center"/>
+              <w:spacing w:before="60" w:after="60"/>
+            </w:pPr>
+            <w:r>
+              <w:rPr>
+                <w:rFonts w:ascii="Times New Roman" w:hAnsi="Times New Roman" w:cs="Times New Roman"/>
+                <w:sz w:val="24"/>
+              </w:rPr>
+              <w:t>No</w:t>
+            </w:r>
+          </w:p>
+        </w:tc>
+        <w:tc>
+          <w:p>
+            <w:pPr>
+              <w:jc w:val="center"/>
+              <w:spacing w:before="60" w:after="60"/>
+            </w:pPr>
+            <w:r>
+              <w:rPr>
+                <w:rFonts w:ascii="Times New Roman" w:hAnsi="Times New Roman" w:cs="Times New Roman"/>
+                <w:sz w:val="24"/>
+              </w:rPr>
+              <w:t>0</w:t>
+            </w:r>
+          </w:p>
+        </w:tc>
+        <w:tc>
+          <w:p>
+            <w:pPr>
+              <w:jc w:val="center"/>
+              <w:spacing w:before="60" w:after="60"/>
+            </w:pPr>
+            <w:r>
+              <w:rPr>
+                <w:rFonts w:ascii="Times New Roman" w:hAnsi="Times New Roman" w:cs="Times New Roman"/>
+                <w:sz w:val="24"/>
+              </w:rPr>
+              <w:t>0%</w:t>
+            </w:r>
+          </w:p>
+        </w:tc>
+      </w:tr>
+      <w:tr>
+        <w:tc>
+          <w:p>
+            <w:pPr>
+              <w:jc w:val="center"/>
+              <w:spacing w:before="60" w:after="60"/>
+            </w:pPr>
+            <w:r>
+              <w:rPr>
+                <w:rFonts w:ascii="Times New Roman" w:hAnsi="Times New Roman" w:cs="Times New Roman"/>
+                <w:sz w:val="24"/>
+              </w:rPr>
+              <w:t>Total</w:t>
+            </w:r>
+          </w:p>
+        </w:tc>
+        <w:tc>
+          <w:p>
+            <w:pPr>
+              <w:jc w:val="center"/>
+              <w:spacing w:before="60" w:after="60"/>
+            </w:pPr>
+            <w:r>
+              <w:rPr>
+                <w:rFonts w:ascii="Times New Roman" w:hAnsi="Times New Roman" w:cs="Times New Roman"/>
+                <w:sz w:val="24"/>
+              </w:rPr>
+              <w:t>3</w:t>
+            </w:r>
+          </w:p>
+        </w:tc>
+        <w:tc>
+          <w:p>
+            <w:pPr>
+              <w:jc w:val="center"/>
+              <w:spacing w:before="60" w:after="60"/>
+            </w:pPr>
+            <w:r>
+              <w:rPr>
+                <w:rFonts w:ascii="Times New Roman" w:hAnsi="Times New Roman" w:cs="Times New Roman"/>
+                <w:sz w:val="24"/>
+              </w:rPr>
+              <w:t>100%</w:t>
+            </w:r>
+          </w:p>
+        </w:tc>
+      </w:tr>
+    </w:tbl>
+    <w:p>
+      <w:pPr>
+        <w:spacing w:line="360" w:lineRule="auto" w:before="0" w:after="120"/>
+        <w:ind w:firstLine="0" w:left="0"/>
+        <w:jc w:val="left"/>
+      </w:pPr>
+      <w:r>
+        <w:rPr>
+          <w:rFonts w:ascii="Times New Roman" w:hAnsi="Times New Roman" w:cs="Times New Roman"/>
+          <w:b w:val="0"/>
+          <w:sz w:val="24"/>
+        </w:rPr>
+        <w:t>Fuente: Alvarado, L. (2026).</w:t>
+      </w:r>
+    </w:p>
+    <w:p>
+      <w:pPr>
+        <w:spacing w:line="360" w:lineRule="auto" w:before="0" w:after="120"/>
+        <w:ind w:firstLine="0" w:left="0"/>
+        <w:jc w:val="center"/>
+      </w:pPr>
+      <w:r>
+        <w:rPr>
+          <w:rFonts w:ascii="Times New Roman" w:hAnsi="Times New Roman" w:cs="Times New Roman"/>
+          <w:b/>
+          <w:sz w:val="24"/>
+        </w:rPr>
+        <w:t>[Insertar Gráfico 5 aquí: Importancia de un sistema centralizado para trazabilidad]</w:t>
+      </w:r>
+    </w:p>
+    <w:p>
+      <w:pPr>
+        <w:spacing w:line="360" w:lineRule="auto" w:before="0" w:after="120"/>
+        <w:ind w:firstLine="0" w:left="0"/>
+        <w:jc w:val="left"/>
+      </w:pPr>
+      <w:r>
+        <w:rPr>
+          <w:rFonts w:ascii="Times New Roman" w:hAnsi="Times New Roman" w:cs="Times New Roman"/>
+          <w:b/>
+          <w:sz w:val="24"/>
+        </w:rPr>
+        <w:t>Análisis e Interpretación</w:t>
+      </w:r>
+    </w:p>
+    <w:p>
+      <w:pPr>
+        <w:spacing w:line="360" w:lineRule="auto" w:before="0" w:after="120"/>
+        <w:ind w:firstLine="720" w:left="0"/>
+        <w:jc w:val="both"/>
+      </w:pPr>
+      <w:r>
+        <w:rPr>
+          <w:rFonts w:ascii="Times New Roman" w:hAnsi="Times New Roman" w:cs="Times New Roman"/>
+          <w:b w:val="0"/>
+          <w:sz w:val="24"/>
+        </w:rPr>
+        <w:t>Los resultados expuestos en el Cuadro 5 indican que el 100% del personal encuestado considera que es fundamental contar con un sistema centralizado para garantizar la trazabilidad de las operaciones comerciales. Esta percepción unánime corrobora el postulado teórico sobre la eficiencia estructural organizacional.</w:t>
+      </w:r>
+    </w:p>
+    <w:p>
+      <w:pPr>
+        <w:spacing w:line="360" w:lineRule="auto" w:before="0" w:after="120"/>
+        <w:ind w:firstLine="720" w:left="0"/>
+        <w:jc w:val="both"/>
+      </w:pPr>
+      <w:r>
+        <w:rPr>
+          <w:rFonts w:ascii="Times New Roman" w:hAnsi="Times New Roman" w:cs="Times New Roman"/>
+          <w:b w:val="0"/>
+          <w:sz w:val="24"/>
+        </w:rPr>
+        <w:t>Según la perspectiva de teóricos como Laudon y Laudon (2012), los sistemas de información deben transformar datos dispersos en repositorios centralizados para apoyar eficazmente el control organizacional. Para Inversiones Más Por Tu Oro 17 C.A., la trazabilidad exacta de cuándo ingresa una joya como garantía y cuándo se liquida el préstamo es el núcleo del negocio. Este resultado valida la arquitectura centralizada del diseño propuesto, superando la gran limitante actual de operar mediante múltiples archivos de ofimática fragmentados.</w:t>
+      </w:r>
+    </w:p>
+    <w:p>
+      <w:pPr>
+        <w:spacing w:line="360" w:lineRule="auto" w:before="0" w:after="120"/>
+        <w:ind w:firstLine="0" w:left="0"/>
+        <w:jc w:val="left"/>
+      </w:pPr>
+      <w:r>
+        <w:rPr>
+          <w:rFonts w:ascii="Times New Roman" w:hAnsi="Times New Roman" w:cs="Times New Roman"/>
+          <w:b/>
+          <w:sz w:val="24"/>
+        </w:rPr>
+        <w:t>Ítem 6. ¿Deben las interfaces ser intuitivas para facilitar el uso?</w:t>
+      </w:r>
+    </w:p>
+    <w:p>
+      <w:pPr>
+        <w:spacing w:line="360" w:lineRule="auto" w:before="0" w:after="120"/>
+        <w:ind w:firstLine="0" w:left="0"/>
+        <w:jc w:val="center"/>
+      </w:pPr>
+      <w:r>
+        <w:rPr>
+          <w:rFonts w:ascii="Times New Roman" w:hAnsi="Times New Roman" w:cs="Times New Roman"/>
+          <w:b w:val="0"/>
+          <w:sz w:val="24"/>
+        </w:rPr>
+        <w:t>Cuadro 6</w:t>
+        <w:br/>
+        <w:t>Necesidad de interfaces intuitivas</w:t>
+      </w:r>
+    </w:p>
+    <w:tbl>
+      <w:tblPr>
+        <w:tblBorders>
+          <w:top w:val="single" w:sz="4" w:space="0" w:color="000000"/>
+          <w:left w:val="single" w:sz="4" w:space="0" w:color="000000"/>
+          <w:bottom w:val="single" w:sz="4" w:space="0" w:color="000000"/>
+          <w:right w:val="single" w:sz="4" w:space="0" w:color="000000"/>
+          <w:insideH w:val="single" w:sz="4" w:space="0" w:color="000000"/>
+          <w:insideV w:val="single" w:sz="4" w:space="0" w:color="000000"/>
+        </w:tblBorders>
+        <w:tblW w:w="5000" w:type="pct"/>
+        <w:jc w:val="center"/>
+      </w:tblPr>
+      <w:tr>
+        <w:tc>
+          <w:p>
+            <w:pPr>
+              <w:jc w:val="center"/>
+              <w:spacing w:before="60" w:after="60"/>
+            </w:pPr>
+            <w:r>
+              <w:rPr>
+                <w:rFonts w:ascii="Times New Roman" w:hAnsi="Times New Roman" w:cs="Times New Roman"/>
+                <w:sz w:val="24"/>
+                <w:b/>
+              </w:rPr>
+              <w:t>Alternativa</w:t>
+            </w:r>
+          </w:p>
+        </w:tc>
+        <w:tc>
+          <w:p>
+            <w:pPr>
+              <w:jc w:val="center"/>
+              <w:spacing w:before="60" w:after="60"/>
+            </w:pPr>
+            <w:r>
+              <w:rPr>
+                <w:rFonts w:ascii="Times New Roman" w:hAnsi="Times New Roman" w:cs="Times New Roman"/>
+                <w:sz w:val="24"/>
+                <w:b/>
+              </w:rPr>
+              <w:t>Frecuencia Absoluta (ƒ)</w:t>
+            </w:r>
+          </w:p>
+        </w:tc>
+        <w:tc>
+          <w:p>
+            <w:pPr>
+              <w:jc w:val="center"/>
+              <w:spacing w:before="60" w:after="60"/>
+            </w:pPr>
+            <w:r>
+              <w:rPr>
+                <w:rFonts w:ascii="Times New Roman" w:hAnsi="Times New Roman" w:cs="Times New Roman"/>
+                <w:sz w:val="24"/>
+                <w:b/>
+              </w:rPr>
+              <w:t>Frecuencia Relativa (%)</w:t>
+            </w:r>
+          </w:p>
+        </w:tc>
+      </w:tr>
+      <w:tr>
+        <w:tc>
+          <w:p>
+            <w:pPr>
+              <w:jc w:val="center"/>
+              <w:spacing w:before="60" w:after="60"/>
+            </w:pPr>
+            <w:r>
+              <w:rPr>
+                <w:rFonts w:ascii="Times New Roman" w:hAnsi="Times New Roman" w:cs="Times New Roman"/>
+                <w:sz w:val="24"/>
+              </w:rPr>
+              <w:t>Sí</w:t>
+            </w:r>
+          </w:p>
+        </w:tc>
+        <w:tc>
+          <w:p>
+            <w:pPr>
+              <w:jc w:val="center"/>
+              <w:spacing w:before="60" w:after="60"/>
+            </w:pPr>
+            <w:r>
+              <w:rPr>
+                <w:rFonts w:ascii="Times New Roman" w:hAnsi="Times New Roman" w:cs="Times New Roman"/>
+                <w:sz w:val="24"/>
+              </w:rPr>
+              <w:t>3</w:t>
+            </w:r>
+          </w:p>
+        </w:tc>
+        <w:tc>
+          <w:p>
+            <w:pPr>
+              <w:jc w:val="center"/>
+              <w:spacing w:before="60" w:after="60"/>
+            </w:pPr>
+            <w:r>
+              <w:rPr>
+                <w:rFonts w:ascii="Times New Roman" w:hAnsi="Times New Roman" w:cs="Times New Roman"/>
+                <w:sz w:val="24"/>
+              </w:rPr>
+              <w:t>100%</w:t>
+            </w:r>
+          </w:p>
+        </w:tc>
+      </w:tr>
+      <w:tr>
+        <w:tc>
+          <w:p>
+            <w:pPr>
+              <w:jc w:val="center"/>
+              <w:spacing w:before="60" w:after="60"/>
+            </w:pPr>
+            <w:r>
+              <w:rPr>
+                <w:rFonts w:ascii="Times New Roman" w:hAnsi="Times New Roman" w:cs="Times New Roman"/>
+                <w:sz w:val="24"/>
+              </w:rPr>
+              <w:t>No</w:t>
+            </w:r>
+          </w:p>
+        </w:tc>
+        <w:tc>
+          <w:p>
+            <w:pPr>
+              <w:jc w:val="center"/>
+              <w:spacing w:before="60" w:after="60"/>
+            </w:pPr>
+            <w:r>
+              <w:rPr>
+                <w:rFonts w:ascii="Times New Roman" w:hAnsi="Times New Roman" w:cs="Times New Roman"/>
+                <w:sz w:val="24"/>
+              </w:rPr>
+              <w:t>0</w:t>
+            </w:r>
+          </w:p>
+        </w:tc>
+        <w:tc>
+          <w:p>
+            <w:pPr>
+              <w:jc w:val="center"/>
+              <w:spacing w:before="60" w:after="60"/>
+            </w:pPr>
+            <w:r>
+              <w:rPr>
+                <w:rFonts w:ascii="Times New Roman" w:hAnsi="Times New Roman" w:cs="Times New Roman"/>
+                <w:sz w:val="24"/>
+              </w:rPr>
+              <w:t>0%</w:t>
+            </w:r>
+          </w:p>
+        </w:tc>
+      </w:tr>
+      <w:tr>
+        <w:tc>
+          <w:p>
+            <w:pPr>
+              <w:jc w:val="center"/>
+              <w:spacing w:before="60" w:after="60"/>
+            </w:pPr>
+            <w:r>
+              <w:rPr>
+                <w:rFonts w:ascii="Times New Roman" w:hAnsi="Times New Roman" w:cs="Times New Roman"/>
+                <w:sz w:val="24"/>
+              </w:rPr>
+              <w:t>Total</w:t>
+            </w:r>
+          </w:p>
+        </w:tc>
+        <w:tc>
+          <w:p>
+            <w:pPr>
+              <w:jc w:val="center"/>
+              <w:spacing w:before="60" w:after="60"/>
+            </w:pPr>
+            <w:r>
+              <w:rPr>
+                <w:rFonts w:ascii="Times New Roman" w:hAnsi="Times New Roman" w:cs="Times New Roman"/>
+                <w:sz w:val="24"/>
+              </w:rPr>
+              <w:t>3</w:t>
+            </w:r>
+          </w:p>
+        </w:tc>
+        <w:tc>
+          <w:p>
+            <w:pPr>
+              <w:jc w:val="center"/>
+              <w:spacing w:before="60" w:after="60"/>
+            </w:pPr>
+            <w:r>
+              <w:rPr>
+                <w:rFonts w:ascii="Times New Roman" w:hAnsi="Times New Roman" w:cs="Times New Roman"/>
+                <w:sz w:val="24"/>
+              </w:rPr>
+              <w:t>100%</w:t>
+            </w:r>
+          </w:p>
+        </w:tc>
+      </w:tr>
+    </w:tbl>
+    <w:p>
+      <w:pPr>
+        <w:spacing w:line="360" w:lineRule="auto" w:before="0" w:after="120"/>
+        <w:ind w:firstLine="0" w:left="0"/>
+        <w:jc w:val="left"/>
+      </w:pPr>
+      <w:r>
+        <w:rPr>
+          <w:rFonts w:ascii="Times New Roman" w:hAnsi="Times New Roman" w:cs="Times New Roman"/>
+          <w:b w:val="0"/>
+          <w:sz w:val="24"/>
+        </w:rPr>
+        <w:t>Fuente: Alvarado, L. (2026).</w:t>
+      </w:r>
+    </w:p>
+    <w:p>
+      <w:pPr>
+        <w:spacing w:line="360" w:lineRule="auto" w:before="0" w:after="120"/>
+        <w:ind w:firstLine="0" w:left="0"/>
+        <w:jc w:val="center"/>
+      </w:pPr>
+      <w:r>
+        <w:rPr>
+          <w:rFonts w:ascii="Times New Roman" w:hAnsi="Times New Roman" w:cs="Times New Roman"/>
+          <w:b/>
+          <w:sz w:val="24"/>
+        </w:rPr>
+        <w:t>[Insertar Gráfico 6 aquí: Necesidad de interfaces intuitivas]</w:t>
+      </w:r>
+    </w:p>
+    <w:p>
+      <w:pPr>
+        <w:spacing w:line="360" w:lineRule="auto" w:before="0" w:after="120"/>
+        <w:ind w:firstLine="0" w:left="0"/>
+        <w:jc w:val="left"/>
+      </w:pPr>
+      <w:r>
+        <w:rPr>
+          <w:rFonts w:ascii="Times New Roman" w:hAnsi="Times New Roman" w:cs="Times New Roman"/>
+          <w:b/>
+          <w:sz w:val="24"/>
+        </w:rPr>
+        <w:t>Análisis e Interpretación</w:t>
+      </w:r>
+    </w:p>
+    <w:p>
+      <w:pPr>
+        <w:spacing w:line="360" w:lineRule="auto" w:before="0" w:after="120"/>
+        <w:ind w:firstLine="720" w:left="0"/>
+        <w:jc w:val="both"/>
+      </w:pPr>
+      <w:r>
+        <w:rPr>
+          <w:rFonts w:ascii="Times New Roman" w:hAnsi="Times New Roman" w:cs="Times New Roman"/>
+          <w:b w:val="0"/>
+          <w:sz w:val="24"/>
+        </w:rPr>
+        <w:t>Tal como se detalla en el Cuadro 6, el 100% de la población concuerda en que las interfaces del nuevo sistema deben ser altamente intuitivas para facilitar su uso diario. Este hallazgo es crucial para la etapa de desarrollo y diseño de la interfaz gráfica e interacción usuario-máquina.</w:t>
+      </w:r>
+    </w:p>
+    <w:p>
+      <w:pPr>
+        <w:spacing w:line="360" w:lineRule="auto" w:before="0" w:after="120"/>
+        <w:ind w:firstLine="720" w:left="0"/>
+        <w:jc w:val="both"/>
+      </w:pPr>
+      <w:r>
+        <w:rPr>
+          <w:rFonts w:ascii="Times New Roman" w:hAnsi="Times New Roman" w:cs="Times New Roman"/>
+          <w:b w:val="0"/>
+          <w:sz w:val="24"/>
+        </w:rPr>
+        <w:t>Atendiendo a lo que establece Pressman (2010) respecto al modelo de construcción de prototipos, la usabilidad y la amigabilidad de la interfaz son determinantes para asegurar la adopción tecnológica por parte del usuario final y minimizar la resistencia al cambio. En consecuencia, el sistema se desarrollará con principios de ergonomía visual y flujos de trabajo claros, asegurando que el cajero y el administrador puedan registrar operaciones complejas de empeño de forma natural y ágil.</w:t>
+      </w:r>
+    </w:p>
+    <w:p>
+      <w:pPr>
+        <w:spacing w:line="360" w:lineRule="auto" w:before="0" w:after="120"/>
+        <w:ind w:firstLine="0" w:left="0"/>
+        <w:jc w:val="left"/>
+      </w:pPr>
+      <w:r>
+        <w:rPr>
+          <w:rFonts w:ascii="Times New Roman" w:hAnsi="Times New Roman" w:cs="Times New Roman"/>
+          <w:b/>
+          <w:sz w:val="24"/>
+        </w:rPr>
+        <w:t>Ítem 7. ¿Requiere reportes administrativos automáticos para gerencia?</w:t>
+      </w:r>
+    </w:p>
+    <w:p>
+      <w:pPr>
+        <w:spacing w:line="360" w:lineRule="auto" w:before="0" w:after="120"/>
+        <w:ind w:firstLine="0" w:left="0"/>
+        <w:jc w:val="center"/>
+      </w:pPr>
+      <w:r>
+        <w:rPr>
+          <w:rFonts w:ascii="Times New Roman" w:hAnsi="Times New Roman" w:cs="Times New Roman"/>
+          <w:b w:val="0"/>
+          <w:sz w:val="24"/>
+        </w:rPr>
+        <w:t>Cuadro 7</w:t>
+        <w:br/>
+        <w:t>Requerimiento de reportes administrativos automáticos</w:t>
+      </w:r>
+    </w:p>
+    <w:tbl>
+      <w:tblPr>
+        <w:tblBorders>
+          <w:top w:val="single" w:sz="4" w:space="0" w:color="000000"/>
+          <w:left w:val="single" w:sz="4" w:space="0" w:color="000000"/>
+          <w:bottom w:val="single" w:sz="4" w:space="0" w:color="000000"/>
+          <w:right w:val="single" w:sz="4" w:space="0" w:color="000000"/>
+          <w:insideH w:val="single" w:sz="4" w:space="0" w:color="000000"/>
+          <w:insideV w:val="single" w:sz="4" w:space="0" w:color="000000"/>
+        </w:tblBorders>
+        <w:tblW w:w="5000" w:type="pct"/>
+        <w:jc w:val="center"/>
+      </w:tblPr>
+      <w:tr>
+        <w:tc>
+          <w:p>
+            <w:pPr>
+              <w:jc w:val="center"/>
+              <w:spacing w:before="60" w:after="60"/>
+            </w:pPr>
+            <w:r>
+              <w:rPr>
+                <w:rFonts w:ascii="Times New Roman" w:hAnsi="Times New Roman" w:cs="Times New Roman"/>
+                <w:sz w:val="24"/>
+                <w:b/>
+              </w:rPr>
+              <w:t>Alternativa</w:t>
+            </w:r>
+          </w:p>
+        </w:tc>
+        <w:tc>
+          <w:p>
+            <w:pPr>
+              <w:jc w:val="center"/>
+              <w:spacing w:before="60" w:after="60"/>
+            </w:pPr>
+            <w:r>
+              <w:rPr>
+                <w:rFonts w:ascii="Times New Roman" w:hAnsi="Times New Roman" w:cs="Times New Roman"/>
+                <w:sz w:val="24"/>
+                <w:b/>
+              </w:rPr>
+              <w:t>Frecuencia Absoluta (ƒ)</w:t>
+            </w:r>
+          </w:p>
+        </w:tc>
+        <w:tc>
+          <w:p>
+            <w:pPr>
+              <w:jc w:val="center"/>
+              <w:spacing w:before="60" w:after="60"/>
+            </w:pPr>
+            <w:r>
+              <w:rPr>
+                <w:rFonts w:ascii="Times New Roman" w:hAnsi="Times New Roman" w:cs="Times New Roman"/>
+                <w:sz w:val="24"/>
+                <w:b/>
+              </w:rPr>
+              <w:t>Frecuencia Relativa (%)</w:t>
+            </w:r>
+          </w:p>
+        </w:tc>
+      </w:tr>
+      <w:tr>
+        <w:tc>
+          <w:p>
+            <w:pPr>
+              <w:jc w:val="center"/>
+              <w:spacing w:before="60" w:after="60"/>
+            </w:pPr>
+            <w:r>
+              <w:rPr>
+                <w:rFonts w:ascii="Times New Roman" w:hAnsi="Times New Roman" w:cs="Times New Roman"/>
+                <w:sz w:val="24"/>
+              </w:rPr>
+              <w:t>Sí</w:t>
+            </w:r>
+          </w:p>
+        </w:tc>
+        <w:tc>
+          <w:p>
+            <w:pPr>
+              <w:jc w:val="center"/>
+              <w:spacing w:before="60" w:after="60"/>
+            </w:pPr>
+            <w:r>
+              <w:rPr>
+                <w:rFonts w:ascii="Times New Roman" w:hAnsi="Times New Roman" w:cs="Times New Roman"/>
+                <w:sz w:val="24"/>
+              </w:rPr>
+              <w:t>3</w:t>
+            </w:r>
+          </w:p>
+        </w:tc>
+        <w:tc>
+          <w:p>
+            <w:pPr>
+              <w:jc w:val="center"/>
+              <w:spacing w:before="60" w:after="60"/>
+            </w:pPr>
+            <w:r>
+              <w:rPr>
+                <w:rFonts w:ascii="Times New Roman" w:hAnsi="Times New Roman" w:cs="Times New Roman"/>
+                <w:sz w:val="24"/>
+              </w:rPr>
+              <w:t>100%</w:t>
+            </w:r>
+          </w:p>
+        </w:tc>
+      </w:tr>
+      <w:tr>
+        <w:tc>
+          <w:p>
+            <w:pPr>
+              <w:jc w:val="center"/>
+              <w:spacing w:before="60" w:after="60"/>
+            </w:pPr>
+            <w:r>
+              <w:rPr>
+                <w:rFonts w:ascii="Times New Roman" w:hAnsi="Times New Roman" w:cs="Times New Roman"/>
+                <w:sz w:val="24"/>
+              </w:rPr>
+              <w:t>No</w:t>
+            </w:r>
+          </w:p>
+        </w:tc>
+        <w:tc>
+          <w:p>
+            <w:pPr>
+              <w:jc w:val="center"/>
+              <w:spacing w:before="60" w:after="60"/>
+            </w:pPr>
+            <w:r>
+              <w:rPr>
+                <w:rFonts w:ascii="Times New Roman" w:hAnsi="Times New Roman" w:cs="Times New Roman"/>
+                <w:sz w:val="24"/>
+              </w:rPr>
+              <w:t>0</w:t>
+            </w:r>
+          </w:p>
+        </w:tc>
+        <w:tc>
+          <w:p>
+            <w:pPr>
+              <w:jc w:val="center"/>
+              <w:spacing w:before="60" w:after="60"/>
+            </w:pPr>
+            <w:r>
+              <w:rPr>
+                <w:rFonts w:ascii="Times New Roman" w:hAnsi="Times New Roman" w:cs="Times New Roman"/>
+                <w:sz w:val="24"/>
+              </w:rPr>
+              <w:t>0%</w:t>
+            </w:r>
+          </w:p>
+        </w:tc>
+      </w:tr>
+      <w:tr>
+        <w:tc>
+          <w:p>
+            <w:pPr>
+              <w:jc w:val="center"/>
+              <w:spacing w:before="60" w:after="60"/>
+            </w:pPr>
+            <w:r>
+              <w:rPr>
+                <w:rFonts w:ascii="Times New Roman" w:hAnsi="Times New Roman" w:cs="Times New Roman"/>
+                <w:sz w:val="24"/>
+              </w:rPr>
+              <w:t>Total</w:t>
+            </w:r>
+          </w:p>
+        </w:tc>
+        <w:tc>
+          <w:p>
+            <w:pPr>
+              <w:jc w:val="center"/>
+              <w:spacing w:before="60" w:after="60"/>
+            </w:pPr>
+            <w:r>
+              <w:rPr>
+                <w:rFonts w:ascii="Times New Roman" w:hAnsi="Times New Roman" w:cs="Times New Roman"/>
+                <w:sz w:val="24"/>
+              </w:rPr>
+              <w:t>3</w:t>
+            </w:r>
+          </w:p>
+        </w:tc>
+        <w:tc>
+          <w:p>
+            <w:pPr>
+              <w:jc w:val="center"/>
+              <w:spacing w:before="60" w:after="60"/>
+            </w:pPr>
+            <w:r>
+              <w:rPr>
+                <w:rFonts w:ascii="Times New Roman" w:hAnsi="Times New Roman" w:cs="Times New Roman"/>
+                <w:sz w:val="24"/>
+              </w:rPr>
+              <w:t>100%</w:t>
+            </w:r>
+          </w:p>
+        </w:tc>
+      </w:tr>
+    </w:tbl>
+    <w:p>
+      <w:pPr>
+        <w:spacing w:line="360" w:lineRule="auto" w:before="0" w:after="120"/>
+        <w:ind w:firstLine="0" w:left="0"/>
+        <w:jc w:val="left"/>
+      </w:pPr>
+      <w:r>
+        <w:rPr>
+          <w:rFonts w:ascii="Times New Roman" w:hAnsi="Times New Roman" w:cs="Times New Roman"/>
+          <w:b w:val="0"/>
+          <w:sz w:val="24"/>
+        </w:rPr>
+        <w:t>Fuente: Alvarado, L. (2026).</w:t>
+      </w:r>
+    </w:p>
+    <w:p>
+      <w:pPr>
+        <w:spacing w:line="360" w:lineRule="auto" w:before="0" w:after="120"/>
+        <w:ind w:firstLine="0" w:left="0"/>
+        <w:jc w:val="center"/>
+      </w:pPr>
+      <w:r>
+        <w:rPr>
+          <w:rFonts w:ascii="Times New Roman" w:hAnsi="Times New Roman" w:cs="Times New Roman"/>
+          <w:b/>
+          <w:sz w:val="24"/>
+        </w:rPr>
+        <w:t>[Insertar Gráfico 7 aquí: Requerimiento de reportes administrativos automáticos]</w:t>
+      </w:r>
+    </w:p>
+    <w:p>
+      <w:pPr>
+        <w:spacing w:line="360" w:lineRule="auto" w:before="0" w:after="120"/>
+        <w:ind w:firstLine="0" w:left="0"/>
+        <w:jc w:val="left"/>
+      </w:pPr>
+      <w:r>
+        <w:rPr>
+          <w:rFonts w:ascii="Times New Roman" w:hAnsi="Times New Roman" w:cs="Times New Roman"/>
+          <w:b/>
+          <w:sz w:val="24"/>
+        </w:rPr>
+        <w:t>Análisis e Interpretación</w:t>
+      </w:r>
+    </w:p>
+    <w:p>
+      <w:pPr>
+        <w:spacing w:line="360" w:lineRule="auto" w:before="0" w:after="120"/>
+        <w:ind w:firstLine="720" w:left="0"/>
+        <w:jc w:val="both"/>
+      </w:pPr>
+      <w:r>
+        <w:rPr>
+          <w:rFonts w:ascii="Times New Roman" w:hAnsi="Times New Roman" w:cs="Times New Roman"/>
+          <w:b w:val="0"/>
+          <w:sz w:val="24"/>
+        </w:rPr>
+        <w:t>El Cuadro 7 demuestra que la totalidad de la muestra (100%) afirma requerir reportes administrativos automáticos para apoyar las funciones de la alta gerencia. Este indicador unánime refleja una necesidad gerencial insatisfecha por el actual modelo manual, el cual demanda una alta e improductiva inversión de horas-hombre para consolidar los cuadres de caja y el estado global del inventario.</w:t>
+      </w:r>
+    </w:p>
+    <w:p>
+      <w:pPr>
+        <w:spacing w:line="360" w:lineRule="auto" w:before="0" w:after="120"/>
+        <w:ind w:firstLine="720" w:left="0"/>
+        <w:jc w:val="both"/>
+      </w:pPr>
+      <w:r>
+        <w:rPr>
+          <w:rFonts w:ascii="Times New Roman" w:hAnsi="Times New Roman" w:cs="Times New Roman"/>
+          <w:b w:val="0"/>
+          <w:sz w:val="24"/>
+        </w:rPr>
+        <w:t>Teóricamente, esto se alinea con la definición de sistemas de información gerencial, cuyo propósito principal es procesar datos transaccionales para la toma de decisiones estratégicas de la directiva. El nuevo software cumplirá con este requerimiento imperativo al incorporar un módulo de reportes automatizados que ofrecerá métricas exactas y balances financieros en tiempo real a la gerencia de la empresa.</w:t>
+      </w:r>
+    </w:p>
+    <w:p>
+      <w:pPr>
+        <w:spacing w:line="360" w:lineRule="auto" w:before="0" w:after="120"/>
+        <w:ind w:firstLine="0" w:left="0"/>
+        <w:jc w:val="left"/>
+      </w:pPr>
+      <w:r>
+        <w:rPr>
+          <w:rFonts w:ascii="Times New Roman" w:hAnsi="Times New Roman" w:cs="Times New Roman"/>
+          <w:b/>
+          <w:sz w:val="24"/>
+        </w:rPr>
+        <w:t>Ítem 8. ¿Es la automatización de consultas esencial para el flujo de trabajo?</w:t>
+      </w:r>
+    </w:p>
+    <w:p>
+      <w:pPr>
+        <w:spacing w:line="360" w:lineRule="auto" w:before="0" w:after="120"/>
+        <w:ind w:firstLine="0" w:left="0"/>
+        <w:jc w:val="center"/>
+      </w:pPr>
+      <w:r>
+        <w:rPr>
+          <w:rFonts w:ascii="Times New Roman" w:hAnsi="Times New Roman" w:cs="Times New Roman"/>
+          <w:b w:val="0"/>
+          <w:sz w:val="24"/>
+        </w:rPr>
+        <w:t>Cuadro 8</w:t>
+        <w:br/>
+        <w:t>Esencialidad de la automatización de consultas</w:t>
+      </w:r>
+    </w:p>
+    <w:tbl>
+      <w:tblPr>
+        <w:tblBorders>
+          <w:top w:val="single" w:sz="4" w:space="0" w:color="000000"/>
+          <w:left w:val="single" w:sz="4" w:space="0" w:color="000000"/>
+          <w:bottom w:val="single" w:sz="4" w:space="0" w:color="000000"/>
+          <w:right w:val="single" w:sz="4" w:space="0" w:color="000000"/>
+          <w:insideH w:val="single" w:sz="4" w:space="0" w:color="000000"/>
+          <w:insideV w:val="single" w:sz="4" w:space="0" w:color="000000"/>
+        </w:tblBorders>
+        <w:tblW w:w="5000" w:type="pct"/>
+        <w:jc w:val="center"/>
+      </w:tblPr>
+      <w:tr>
+        <w:tc>
+          <w:p>
+            <w:pPr>
+              <w:jc w:val="center"/>
+              <w:spacing w:before="60" w:after="60"/>
+            </w:pPr>
+            <w:r>
+              <w:rPr>
+                <w:rFonts w:ascii="Times New Roman" w:hAnsi="Times New Roman" w:cs="Times New Roman"/>
+                <w:sz w:val="24"/>
+                <w:b/>
+              </w:rPr>
+              <w:t>Alternativa</w:t>
+            </w:r>
+          </w:p>
+        </w:tc>
+        <w:tc>
+          <w:p>
+            <w:pPr>
+              <w:jc w:val="center"/>
+              <w:spacing w:before="60" w:after="60"/>
+            </w:pPr>
+            <w:r>
+              <w:rPr>
+                <w:rFonts w:ascii="Times New Roman" w:hAnsi="Times New Roman" w:cs="Times New Roman"/>
+                <w:sz w:val="24"/>
+                <w:b/>
+              </w:rPr>
+              <w:t>Frecuencia Absoluta (ƒ)</w:t>
+            </w:r>
+          </w:p>
+        </w:tc>
+        <w:tc>
+          <w:p>
+            <w:pPr>
+              <w:jc w:val="center"/>
+              <w:spacing w:before="60" w:after="60"/>
+            </w:pPr>
+            <w:r>
+              <w:rPr>
+                <w:rFonts w:ascii="Times New Roman" w:hAnsi="Times New Roman" w:cs="Times New Roman"/>
+                <w:sz w:val="24"/>
+                <w:b/>
+              </w:rPr>
+              <w:t>Frecuencia Relativa (%)</w:t>
+            </w:r>
+          </w:p>
+        </w:tc>
+      </w:tr>
+      <w:tr>
+        <w:tc>
+          <w:p>
+            <w:pPr>
+              <w:jc w:val="center"/>
+              <w:spacing w:before="60" w:after="60"/>
+            </w:pPr>
+            <w:r>
+              <w:rPr>
+                <w:rFonts w:ascii="Times New Roman" w:hAnsi="Times New Roman" w:cs="Times New Roman"/>
+                <w:sz w:val="24"/>
+              </w:rPr>
+              <w:t>Sí</w:t>
+            </w:r>
+          </w:p>
+        </w:tc>
+        <w:tc>
+          <w:p>
+            <w:pPr>
+              <w:jc w:val="center"/>
+              <w:spacing w:before="60" w:after="60"/>
+            </w:pPr>
+            <w:r>
+              <w:rPr>
+                <w:rFonts w:ascii="Times New Roman" w:hAnsi="Times New Roman" w:cs="Times New Roman"/>
+                <w:sz w:val="24"/>
+              </w:rPr>
+              <w:t>3</w:t>
+            </w:r>
+          </w:p>
+        </w:tc>
+        <w:tc>
+          <w:p>
+            <w:pPr>
+              <w:jc w:val="center"/>
+              <w:spacing w:before="60" w:after="60"/>
+            </w:pPr>
+            <w:r>
+              <w:rPr>
+                <w:rFonts w:ascii="Times New Roman" w:hAnsi="Times New Roman" w:cs="Times New Roman"/>
+                <w:sz w:val="24"/>
+              </w:rPr>
+              <w:t>100%</w:t>
+            </w:r>
+          </w:p>
+        </w:tc>
+      </w:tr>
+      <w:tr>
+        <w:tc>
+          <w:p>
+            <w:pPr>
+              <w:jc w:val="center"/>
+              <w:spacing w:before="60" w:after="60"/>
+            </w:pPr>
+            <w:r>
+              <w:rPr>
+                <w:rFonts w:ascii="Times New Roman" w:hAnsi="Times New Roman" w:cs="Times New Roman"/>
+                <w:sz w:val="24"/>
+              </w:rPr>
+              <w:t>No</w:t>
+            </w:r>
+          </w:p>
+        </w:tc>
+        <w:tc>
+          <w:p>
+            <w:pPr>
+              <w:jc w:val="center"/>
+              <w:spacing w:before="60" w:after="60"/>
+            </w:pPr>
+            <w:r>
+              <w:rPr>
+                <w:rFonts w:ascii="Times New Roman" w:hAnsi="Times New Roman" w:cs="Times New Roman"/>
+                <w:sz w:val="24"/>
+              </w:rPr>
+              <w:t>0</w:t>
+            </w:r>
+          </w:p>
+        </w:tc>
+        <w:tc>
+          <w:p>
+            <w:pPr>
+              <w:jc w:val="center"/>
+              <w:spacing w:before="60" w:after="60"/>
+            </w:pPr>
+            <w:r>
+              <w:rPr>
+                <w:rFonts w:ascii="Times New Roman" w:hAnsi="Times New Roman" w:cs="Times New Roman"/>
+                <w:sz w:val="24"/>
+              </w:rPr>
+              <w:t>0%</w:t>
+            </w:r>
+          </w:p>
+        </w:tc>
+      </w:tr>
+      <w:tr>
+        <w:tc>
+          <w:p>
+            <w:pPr>
+              <w:jc w:val="center"/>
+              <w:spacing w:before="60" w:after="60"/>
+            </w:pPr>
+            <w:r>
+              <w:rPr>
+                <w:rFonts w:ascii="Times New Roman" w:hAnsi="Times New Roman" w:cs="Times New Roman"/>
+                <w:sz w:val="24"/>
+              </w:rPr>
+              <w:t>Total</w:t>
+            </w:r>
+          </w:p>
+        </w:tc>
+        <w:tc>
+          <w:p>
+            <w:pPr>
+              <w:jc w:val="center"/>
+              <w:spacing w:before="60" w:after="60"/>
+            </w:pPr>
+            <w:r>
+              <w:rPr>
+                <w:rFonts w:ascii="Times New Roman" w:hAnsi="Times New Roman" w:cs="Times New Roman"/>
+                <w:sz w:val="24"/>
+              </w:rPr>
+              <w:t>3</w:t>
+            </w:r>
+          </w:p>
+        </w:tc>
+        <w:tc>
+          <w:p>
+            <w:pPr>
+              <w:jc w:val="center"/>
+              <w:spacing w:before="60" w:after="60"/>
+            </w:pPr>
+            <w:r>
+              <w:rPr>
+                <w:rFonts w:ascii="Times New Roman" w:hAnsi="Times New Roman" w:cs="Times New Roman"/>
+                <w:sz w:val="24"/>
+              </w:rPr>
+              <w:t>100%</w:t>
+            </w:r>
+          </w:p>
+        </w:tc>
+      </w:tr>
+    </w:tbl>
+    <w:p>
+      <w:pPr>
+        <w:spacing w:line="360" w:lineRule="auto" w:before="0" w:after="120"/>
+        <w:ind w:firstLine="0" w:left="0"/>
+        <w:jc w:val="left"/>
+      </w:pPr>
+      <w:r>
+        <w:rPr>
+          <w:rFonts w:ascii="Times New Roman" w:hAnsi="Times New Roman" w:cs="Times New Roman"/>
+          <w:b w:val="0"/>
+          <w:sz w:val="24"/>
+        </w:rPr>
+        <w:t>Fuente: Alvarado, L. (2026).</w:t>
+      </w:r>
+    </w:p>
+    <w:p>
+      <w:pPr>
+        <w:spacing w:line="360" w:lineRule="auto" w:before="0" w:after="120"/>
+        <w:ind w:firstLine="0" w:left="0"/>
+        <w:jc w:val="center"/>
+      </w:pPr>
+      <w:r>
+        <w:rPr>
+          <w:rFonts w:ascii="Times New Roman" w:hAnsi="Times New Roman" w:cs="Times New Roman"/>
+          <w:b/>
+          <w:sz w:val="24"/>
+        </w:rPr>
+        <w:t>[Insertar Gráfico 8 aquí: Esencialidad de la automatización de consultas]</w:t>
+      </w:r>
+    </w:p>
+    <w:p>
+      <w:pPr>
+        <w:spacing w:line="360" w:lineRule="auto" w:before="0" w:after="120"/>
+        <w:ind w:firstLine="0" w:left="0"/>
+        <w:jc w:val="left"/>
+      </w:pPr>
+      <w:r>
+        <w:rPr>
+          <w:rFonts w:ascii="Times New Roman" w:hAnsi="Times New Roman" w:cs="Times New Roman"/>
+          <w:b/>
+          <w:sz w:val="24"/>
+        </w:rPr>
+        <w:t>Análisis e Interpretación</w:t>
+      </w:r>
+    </w:p>
+    <w:p>
+      <w:pPr>
+        <w:spacing w:line="360" w:lineRule="auto" w:before="0" w:after="120"/>
+        <w:ind w:firstLine="720" w:left="0"/>
+        <w:jc w:val="both"/>
+      </w:pPr>
+      <w:r>
+        <w:rPr>
+          <w:rFonts w:ascii="Times New Roman" w:hAnsi="Times New Roman" w:cs="Times New Roman"/>
+          <w:b w:val="0"/>
+          <w:sz w:val="24"/>
+        </w:rPr>
+        <w:t>Finalmente, el Cuadro 8 refleja que el 100% de los empleados encuestados considera que la automatización de consultas es un elemento esencial para optimizar el flujo de trabajo diario de la organización. Este resultado reafirma de manera concluyente la viabilidad y pertinencia del proyecto factible aquí planteado.</w:t>
+      </w:r>
+    </w:p>
+    <w:p>
+      <w:pPr>
+        <w:spacing w:line="360" w:lineRule="auto" w:before="0" w:after="120"/>
+        <w:ind w:firstLine="720" w:left="0"/>
+        <w:jc w:val="both"/>
+      </w:pPr>
+      <w:r>
+        <w:rPr>
+          <w:rFonts w:ascii="Times New Roman" w:hAnsi="Times New Roman" w:cs="Times New Roman"/>
+          <w:b w:val="0"/>
+          <w:sz w:val="24"/>
+        </w:rPr>
+        <w:t>Al automatizar la consulta del estatus de los contratos prendarios, los cálculos de interés compuesto y la disponibilidad de metales en bóveda, se eliminarán drásticamente los tiempos muertos operativos, garantizando simultáneamente una atención al cliente de primer nivel. Este hallazgo cierra la etapa de diagnóstico con una validación absoluta por parte de los futuros usuarios, justificando tanto técnica como operativamente la implementación definitiva del sistema de información web para Inversiones Más Por Tu Oro 17 C.A.</w:t>
       </w:r>
     </w:p>
     <w:p>

</xml_diff>